<commit_message>
Preserve Appendix 12 blank typography: Times New Roman, bold, and gerb layout.
Rebuild the DOCX template so the coat of arms sits beside ОБЩИНА ТРОЯН and field fills no longer flatten bold/italic runs.

Co-authored-by: Anatoli Penev <toli18@users.noreply.github.com>
</commit_message>
<xml_diff>
--- a/backend/app/static/troyan-hall/prilozhenie-12.docx
+++ b/backend/app/static/troyan-hall/prilozhenie-12.docx
@@ -7,144 +7,183 @@
         <w:tblW w:type="auto" w:w="0"/>
         <w:tblLayout w:type="autofit"/>
         <w:tblLook w:firstColumn="1" w:firstRow="1" w:lastColumn="0" w:lastRow="0" w:noHBand="0" w:noVBand="1" w:val="04A0"/>
+        <w:tblBorders>
+          <w:top w:val="nil" w:sz="0" w:space="0" w:color="auto"/>
+          <w:left w:val="nil" w:sz="0" w:space="0" w:color="auto"/>
+          <w:bottom w:val="nil" w:sz="0" w:space="0" w:color="auto"/>
+          <w:right w:val="nil" w:sz="0" w:space="0" w:color="auto"/>
+          <w:insideH w:val="nil" w:sz="0" w:space="0" w:color="auto"/>
+          <w:insideV w:val="nil" w:sz="0" w:space="0" w:color="auto"/>
+        </w:tblBorders>
       </w:tblPr>
       <w:tblGrid>
-        <w:gridCol w:w="4986"/>
-        <w:gridCol w:w="4986"/>
+        <w:gridCol w:w="4819"/>
+        <w:gridCol w:w="4819"/>
       </w:tblGrid>
       <w:tr>
         <w:tc>
           <w:tcPr>
-            <w:tcW w:type="dxa" w:w="4986"/>
+            <w:tcW w:type="dxa" w:w="5953"/>
+          </w:tcPr>
+          <w:tbl>
+            <w:tblPr>
+              <w:tblW w:type="auto" w:w="0"/>
+              <w:tblLook w:firstColumn="1" w:firstRow="1" w:lastColumn="0" w:lastRow="0" w:noHBand="0" w:noVBand="1" w:val="04A0"/>
+              <w:tblBorders>
+                <w:top w:val="nil" w:sz="0" w:space="0" w:color="auto"/>
+                <w:left w:val="nil" w:sz="0" w:space="0" w:color="auto"/>
+                <w:bottom w:val="nil" w:sz="0" w:space="0" w:color="auto"/>
+                <w:right w:val="nil" w:sz="0" w:space="0" w:color="auto"/>
+                <w:insideH w:val="nil" w:sz="0" w:space="0" w:color="auto"/>
+                <w:insideV w:val="nil" w:sz="0" w:space="0" w:color="auto"/>
+              </w:tblBorders>
+            </w:tblPr>
+            <w:tblGrid>
+              <w:gridCol w:w="2976"/>
+              <w:gridCol w:w="2976"/>
+            </w:tblGrid>
+            <w:tr>
+              <w:tc>
+                <w:tcPr>
+                  <w:tcW w:type="dxa" w:w="1020"/>
+                </w:tcPr>
+                <w:p>
+                  <w:pPr>
+                    <w:spacing w:before="0" w:after="0" w:line="240" w:lineRule="auto"/>
+                  </w:pPr>
+                  <w:r>
+                    <w:drawing>
+                      <wp:inline xmlns:a="http://schemas.openxmlformats.org/drawingml/2006/main" xmlns:pic="http://schemas.openxmlformats.org/drawingml/2006/picture">
+                        <wp:extent cx="558000" cy="748376"/>
+                        <wp:docPr id="1" name="Picture 1"/>
+                        <wp:cNvGraphicFramePr>
+                          <a:graphicFrameLocks noChangeAspect="1"/>
+                        </wp:cNvGraphicFramePr>
+                        <a:graphic>
+                          <a:graphicData uri="http://schemas.openxmlformats.org/drawingml/2006/picture">
+                            <pic:pic>
+                              <pic:nvPicPr>
+                                <pic:cNvPr id="0" name="obshtina-troyan-logo.png"/>
+                                <pic:cNvPicPr/>
+                              </pic:nvPicPr>
+                              <pic:blipFill>
+                                <a:blip r:embed="rId9"/>
+                                <a:stretch>
+                                  <a:fillRect/>
+                                </a:stretch>
+                              </pic:blipFill>
+                              <pic:spPr>
+                                <a:xfrm>
+                                  <a:off x="0" y="0"/>
+                                  <a:ext cx="558000" cy="748376"/>
+                                </a:xfrm>
+                                <a:prstGeom prst="rect"/>
+                              </pic:spPr>
+                            </pic:pic>
+                          </a:graphicData>
+                        </a:graphic>
+                      </wp:inline>
+                    </w:drawing>
+                  </w:r>
+                </w:p>
+              </w:tc>
+              <w:tc>
+                <w:tcPr>
+                  <w:tcW w:type="dxa" w:w="4819"/>
+                </w:tcPr>
+                <w:p>
+                  <w:pPr>
+                    <w:spacing w:before="40" w:after="0" w:line="240" w:lineRule="auto"/>
+                  </w:pPr>
+                  <w:r>
+                    <w:rPr>
+                      <w:rFonts w:ascii="Times New Roman" w:hAnsi="Times New Roman" w:cs="Times New Roman" w:eastAsia="Times New Roman"/>
+                      <w:b/>
+                      <w:i w:val="0"/>
+                      <w:sz w:val="28"/>
+                    </w:rPr>
+                    <w:t>ОБЩИНА ТРОЯН</w:t>
+                  </w:r>
+                </w:p>
+                <w:p>
+                  <w:pPr>
+                    <w:spacing w:before="40" w:after="0" w:line="240" w:lineRule="auto"/>
+                  </w:pPr>
+                  <w:r>
+                    <w:rPr>
+                      <w:rFonts w:ascii="Times New Roman" w:hAnsi="Times New Roman" w:cs="Times New Roman" w:eastAsia="Times New Roman"/>
+                      <w:b w:val="0"/>
+                      <w:i w:val="0"/>
+                      <w:sz w:val="22"/>
+                    </w:rPr>
+                    <w:t>№ .............................................</w:t>
+                  </w:r>
+                </w:p>
+              </w:tc>
+            </w:tr>
+          </w:tbl>
+          <w:p/>
+        </w:tc>
+        <w:tc>
+          <w:tcPr>
+            <w:tcW w:type="dxa" w:w="4252"/>
           </w:tcPr>
           <w:p>
             <w:pPr>
-              <w:spacing w:after="0"/>
-            </w:pPr>
-            <w:r>
-              <w:drawing>
-                <wp:inline xmlns:a="http://schemas.openxmlformats.org/drawingml/2006/main" xmlns:pic="http://schemas.openxmlformats.org/drawingml/2006/picture">
-                  <wp:extent cx="503999" cy="675952"/>
-                  <wp:docPr id="1" name="Picture 1"/>
-                  <wp:cNvGraphicFramePr>
-                    <a:graphicFrameLocks noChangeAspect="1"/>
-                  </wp:cNvGraphicFramePr>
-                  <a:graphic>
-                    <a:graphicData uri="http://schemas.openxmlformats.org/drawingml/2006/picture">
-                      <pic:pic>
-                        <pic:nvPicPr>
-                          <pic:cNvPr id="0" name="obshtina-troyan-logo.png"/>
-                          <pic:cNvPicPr/>
-                        </pic:nvPicPr>
-                        <pic:blipFill>
-                          <a:blip r:embed="rId9"/>
-                          <a:stretch>
-                            <a:fillRect/>
-                          </a:stretch>
-                        </pic:blipFill>
-                        <pic:spPr>
-                          <a:xfrm>
-                            <a:off x="0" y="0"/>
-                            <a:ext cx="503999" cy="675952"/>
-                          </a:xfrm>
-                          <a:prstGeom prst="rect"/>
-                        </pic:spPr>
-                      </pic:pic>
-                    </a:graphicData>
-                  </a:graphic>
-                </wp:inline>
-              </w:drawing>
-            </w:r>
-          </w:p>
-          <w:p>
-            <w:pPr>
-              <w:spacing w:before="40" w:after="0"/>
-            </w:pPr>
-            <w:r>
-              <w:rPr>
-                <w:rFonts w:ascii="Times New Roman" w:hAnsi="Times New Roman" w:eastAsia="Times New Roman"/>
-                <w:b/>
-                <w:i w:val="0"/>
-                <w:sz w:val="24"/>
-              </w:rPr>
-              <w:t>ОБЩИНА ТРОЯН</w:t>
-            </w:r>
-          </w:p>
-          <w:p>
-            <w:pPr>
-              <w:spacing w:before="0" w:after="0"/>
-            </w:pPr>
-            <w:r>
-              <w:rPr>
-                <w:rFonts w:ascii="Times New Roman" w:hAnsi="Times New Roman" w:eastAsia="Times New Roman"/>
-                <w:b w:val="0"/>
-                <w:i w:val="0"/>
-                <w:sz w:val="20"/>
-              </w:rPr>
-              <w:t>№ .............................................</w:t>
-            </w:r>
-          </w:p>
-        </w:tc>
-        <w:tc>
-          <w:tcPr>
-            <w:tcW w:type="dxa" w:w="4986"/>
-          </w:tcPr>
-          <w:p>
-            <w:pPr>
-              <w:spacing w:after="0"/>
+              <w:spacing w:before="0" w:after="0" w:line="240" w:lineRule="auto"/>
               <w:jc w:val="right"/>
             </w:pPr>
             <w:r>
               <w:rPr>
-                <w:rFonts w:ascii="Times New Roman" w:hAnsi="Times New Roman" w:eastAsia="Times New Roman"/>
+                <w:rFonts w:ascii="Times New Roman" w:hAnsi="Times New Roman" w:cs="Times New Roman" w:eastAsia="Times New Roman"/>
                 <w:b/>
                 <w:i w:val="0"/>
-                <w:sz w:val="22"/>
+                <w:sz w:val="28"/>
               </w:rPr>
               <w:t>Приложение № 12</w:t>
             </w:r>
           </w:p>
           <w:p>
             <w:pPr>
-              <w:spacing w:before="0" w:after="0"/>
+              <w:spacing w:before="0" w:after="0" w:line="240" w:lineRule="auto"/>
               <w:jc w:val="right"/>
             </w:pPr>
             <w:r>
               <w:rPr>
-                <w:rFonts w:ascii="Times New Roman" w:hAnsi="Times New Roman" w:eastAsia="Times New Roman"/>
+                <w:rFonts w:ascii="Times New Roman" w:hAnsi="Times New Roman" w:cs="Times New Roman" w:eastAsia="Times New Roman"/>
                 <w:b w:val="0"/>
                 <w:i/>
-                <w:sz w:val="18"/>
+                <w:sz w:val="20"/>
               </w:rPr>
               <w:t>(ново, Решение № 965/17.09.2026 г.)</w:t>
             </w:r>
           </w:p>
           <w:p>
             <w:pPr>
-              <w:spacing w:before="80" w:after="0"/>
+              <w:spacing w:before="120" w:after="0" w:line="240" w:lineRule="auto"/>
               <w:jc w:val="right"/>
             </w:pPr>
             <w:r>
               <w:rPr>
-                <w:rFonts w:ascii="Times New Roman" w:hAnsi="Times New Roman" w:eastAsia="Times New Roman"/>
+                <w:rFonts w:ascii="Times New Roman" w:hAnsi="Times New Roman" w:cs="Times New Roman" w:eastAsia="Times New Roman"/>
                 <w:b w:val="0"/>
                 <w:i w:val="0"/>
-                <w:sz w:val="20"/>
+                <w:sz w:val="22"/>
               </w:rPr>
               <w:t>Вх. № .............................................</w:t>
             </w:r>
           </w:p>
           <w:p>
             <w:pPr>
-              <w:spacing w:before="0" w:after="0"/>
+              <w:spacing w:before="0" w:after="0" w:line="240" w:lineRule="auto"/>
               <w:jc w:val="right"/>
             </w:pPr>
             <w:r>
               <w:rPr>
-                <w:rFonts w:ascii="Times New Roman" w:hAnsi="Times New Roman" w:eastAsia="Times New Roman"/>
+                <w:rFonts w:ascii="Times New Roman" w:hAnsi="Times New Roman" w:cs="Times New Roman" w:eastAsia="Times New Roman"/>
                 <w:b w:val="0"/>
                 <w:i w:val="0"/>
-                <w:sz w:val="20"/>
+                <w:sz w:val="22"/>
               </w:rPr>
               <w:t>Дата ...............................................</w:t>
             </w:r>
@@ -154,7 +193,7 @@
     </w:tbl>
     <w:p>
       <w:pPr>
-        <w:spacing w:before="0" w:after="120" w:line="240" w:lineRule="auto"/>
+        <w:spacing w:before="0" w:after="160" w:line="240" w:lineRule="auto"/>
       </w:pPr>
     </w:p>
     <w:p>
@@ -164,10 +203,10 @@
       </w:pPr>
       <w:r>
         <w:rPr>
-          <w:rFonts w:ascii="Times New Roman" w:hAnsi="Times New Roman" w:eastAsia="Times New Roman"/>
+          <w:rFonts w:ascii="Times New Roman" w:hAnsi="Times New Roman" w:cs="Times New Roman" w:eastAsia="Times New Roman"/>
           <w:b/>
           <w:i w:val="0"/>
-          <w:sz w:val="28"/>
+          <w:sz w:val="32"/>
         </w:rPr>
         <w:t>ЗАЯВЛЕНИЕ</w:t>
       </w:r>
@@ -179,25 +218,25 @@
       </w:pPr>
       <w:r>
         <w:rPr>
-          <w:rFonts w:ascii="Times New Roman" w:hAnsi="Times New Roman" w:eastAsia="Times New Roman"/>
+          <w:rFonts w:ascii="Times New Roman" w:hAnsi="Times New Roman" w:cs="Times New Roman" w:eastAsia="Times New Roman"/>
           <w:b/>
           <w:i w:val="0"/>
-          <w:sz w:val="22"/>
+          <w:sz w:val="28"/>
         </w:rPr>
         <w:t>ползване на спортни зали и помещения в</w:t>
       </w:r>
     </w:p>
     <w:p>
       <w:pPr>
-        <w:spacing w:before="0" w:after="160" w:line="240" w:lineRule="auto"/>
+        <w:spacing w:before="0" w:after="200" w:line="240" w:lineRule="auto"/>
         <w:jc w:val="center"/>
       </w:pPr>
       <w:r>
         <w:rPr>
-          <w:rFonts w:ascii="Times New Roman" w:hAnsi="Times New Roman" w:eastAsia="Times New Roman"/>
+          <w:rFonts w:ascii="Times New Roman" w:hAnsi="Times New Roman" w:cs="Times New Roman" w:eastAsia="Times New Roman"/>
           <w:b/>
           <w:i w:val="0"/>
-          <w:sz w:val="22"/>
+          <w:sz w:val="28"/>
         </w:rPr>
         <w:t>Многофункционална спортна зала „Троян“</w:t>
       </w:r>
@@ -208,12 +247,21 @@
       </w:pPr>
       <w:r>
         <w:rPr>
-          <w:rFonts w:ascii="Times New Roman" w:hAnsi="Times New Roman" w:eastAsia="Times New Roman"/>
+          <w:rFonts w:ascii="Times New Roman" w:hAnsi="Times New Roman" w:cs="Times New Roman" w:eastAsia="Times New Roman"/>
           <w:b w:val="0"/>
           <w:i w:val="0"/>
-          <w:sz w:val="22"/>
+          <w:sz w:val="28"/>
         </w:rPr>
-        <w:t>от {{ORG_NAME}}</w:t>
+        <w:t xml:space="preserve">от </w:t>
+      </w:r>
+      <w:r>
+        <w:rPr>
+          <w:rFonts w:ascii="Times New Roman" w:hAnsi="Times New Roman" w:cs="Times New Roman" w:eastAsia="Times New Roman"/>
+          <w:b w:val="0"/>
+          <w:i w:val="0"/>
+          <w:sz w:val="28"/>
+        </w:rPr>
+        <w:t>{{ORG_NAME}}</w:t>
       </w:r>
     </w:p>
     <w:p>
@@ -223,10 +271,10 @@
       </w:pPr>
       <w:r>
         <w:rPr>
-          <w:rFonts w:ascii="Times New Roman" w:hAnsi="Times New Roman" w:eastAsia="Times New Roman"/>
+          <w:rFonts w:ascii="Times New Roman" w:hAnsi="Times New Roman" w:cs="Times New Roman" w:eastAsia="Times New Roman"/>
           <w:b w:val="0"/>
           <w:i/>
-          <w:sz w:val="18"/>
+          <w:sz w:val="20"/>
         </w:rPr>
         <w:t>(посочете трите имена за физическото лице или наименованието на юридическото лице)</w:t>
       </w:r>
@@ -237,12 +285,129 @@
       </w:pPr>
       <w:r>
         <w:rPr>
-          <w:rFonts w:ascii="Times New Roman" w:hAnsi="Times New Roman" w:eastAsia="Times New Roman"/>
+          <w:rFonts w:ascii="Times New Roman" w:hAnsi="Times New Roman" w:cs="Times New Roman" w:eastAsia="Times New Roman"/>
           <w:b w:val="0"/>
           <w:i w:val="0"/>
-          <w:sz w:val="22"/>
+          <w:sz w:val="28"/>
         </w:rPr>
-        <w:t>ЕГН/ЕИК {{EIK}}, постоянен/настоящ адрес или адрес на управление на юридическото лице: гр./с. {{CITY}}, община {{MUNICIPALITY}}, област {{OBLAST}}, ул. (ж.к.) {{STREET}}, тел.: {{PHONE}} представляван/а от {{REP_NAME}}</w:t>
+        <w:t xml:space="preserve">ЕГН/ЕИК </w:t>
+      </w:r>
+      <w:r>
+        <w:rPr>
+          <w:rFonts w:ascii="Times New Roman" w:hAnsi="Times New Roman" w:cs="Times New Roman" w:eastAsia="Times New Roman"/>
+          <w:b w:val="0"/>
+          <w:i w:val="0"/>
+          <w:sz w:val="28"/>
+        </w:rPr>
+        <w:t>{{EIK}}</w:t>
+      </w:r>
+      <w:r>
+        <w:rPr>
+          <w:rFonts w:ascii="Times New Roman" w:hAnsi="Times New Roman" w:cs="Times New Roman" w:eastAsia="Times New Roman"/>
+          <w:b w:val="0"/>
+          <w:i w:val="0"/>
+          <w:sz w:val="28"/>
+        </w:rPr>
+        <w:t xml:space="preserve">, постоянен/настоящ адрес или адрес на управление на юридическото лице: гр./с. </w:t>
+      </w:r>
+      <w:r>
+        <w:rPr>
+          <w:rFonts w:ascii="Times New Roman" w:hAnsi="Times New Roman" w:cs="Times New Roman" w:eastAsia="Times New Roman"/>
+          <w:b w:val="0"/>
+          <w:i w:val="0"/>
+          <w:sz w:val="28"/>
+        </w:rPr>
+        <w:t>{{CITY}}</w:t>
+      </w:r>
+      <w:r>
+        <w:rPr>
+          <w:rFonts w:ascii="Times New Roman" w:hAnsi="Times New Roman" w:cs="Times New Roman" w:eastAsia="Times New Roman"/>
+          <w:b w:val="0"/>
+          <w:i w:val="0"/>
+          <w:sz w:val="28"/>
+        </w:rPr>
+        <w:t xml:space="preserve">, община </w:t>
+      </w:r>
+      <w:r>
+        <w:rPr>
+          <w:rFonts w:ascii="Times New Roman" w:hAnsi="Times New Roman" w:cs="Times New Roman" w:eastAsia="Times New Roman"/>
+          <w:b w:val="0"/>
+          <w:i w:val="0"/>
+          <w:sz w:val="28"/>
+        </w:rPr>
+        <w:t>{{MUNICIPALITY}}</w:t>
+      </w:r>
+      <w:r>
+        <w:rPr>
+          <w:rFonts w:ascii="Times New Roman" w:hAnsi="Times New Roman" w:cs="Times New Roman" w:eastAsia="Times New Roman"/>
+          <w:b w:val="0"/>
+          <w:i w:val="0"/>
+          <w:sz w:val="28"/>
+        </w:rPr>
+        <w:t xml:space="preserve">, област </w:t>
+      </w:r>
+      <w:r>
+        <w:rPr>
+          <w:rFonts w:ascii="Times New Roman" w:hAnsi="Times New Roman" w:cs="Times New Roman" w:eastAsia="Times New Roman"/>
+          <w:b w:val="0"/>
+          <w:i w:val="0"/>
+          <w:sz w:val="28"/>
+        </w:rPr>
+        <w:t>{{OBLAST}}</w:t>
+      </w:r>
+      <w:r>
+        <w:rPr>
+          <w:rFonts w:ascii="Times New Roman" w:hAnsi="Times New Roman" w:cs="Times New Roman" w:eastAsia="Times New Roman"/>
+          <w:b w:val="0"/>
+          <w:i w:val="0"/>
+          <w:sz w:val="28"/>
+        </w:rPr>
+        <w:t xml:space="preserve">, ул. (ж.к.) </w:t>
+      </w:r>
+      <w:r>
+        <w:rPr>
+          <w:rFonts w:ascii="Times New Roman" w:hAnsi="Times New Roman" w:cs="Times New Roman" w:eastAsia="Times New Roman"/>
+          <w:b w:val="0"/>
+          <w:i w:val="0"/>
+          <w:sz w:val="28"/>
+        </w:rPr>
+        <w:t>{{STREET}}</w:t>
+      </w:r>
+      <w:r>
+        <w:rPr>
+          <w:rFonts w:ascii="Times New Roman" w:hAnsi="Times New Roman" w:cs="Times New Roman" w:eastAsia="Times New Roman"/>
+          <w:b w:val="0"/>
+          <w:i w:val="0"/>
+          <w:sz w:val="28"/>
+        </w:rPr>
+        <w:t xml:space="preserve">, тел.: </w:t>
+      </w:r>
+      <w:r>
+        <w:rPr>
+          <w:rFonts w:ascii="Times New Roman" w:hAnsi="Times New Roman" w:cs="Times New Roman" w:eastAsia="Times New Roman"/>
+          <w:b w:val="0"/>
+          <w:i w:val="0"/>
+          <w:sz w:val="28"/>
+        </w:rPr>
+        <w:t>{{PHONE}}</w:t>
+      </w:r>
+      <w:r>
+        <w:rPr>
+          <w:rFonts w:ascii="Times New Roman" w:hAnsi="Times New Roman" w:cs="Times New Roman" w:eastAsia="Times New Roman"/>
+          <w:b w:val="0"/>
+          <w:i w:val="0"/>
+          <w:sz w:val="28"/>
+        </w:rPr>
+        <w:t xml:space="preserve"> представляван/а от </w:t>
+      </w:r>
+      <w:r>
+        <w:rPr>
+          <w:rFonts w:ascii="Times New Roman" w:hAnsi="Times New Roman" w:cs="Times New Roman" w:eastAsia="Times New Roman"/>
+          <w:b w:val="0"/>
+          <w:i w:val="0"/>
+          <w:sz w:val="28"/>
+        </w:rPr>
+        <w:t>{{REP_NAME}}</w:t>
       </w:r>
     </w:p>
     <w:p>
@@ -252,10 +417,10 @@
       </w:pPr>
       <w:r>
         <w:rPr>
-          <w:rFonts w:ascii="Times New Roman" w:hAnsi="Times New Roman" w:eastAsia="Times New Roman"/>
+          <w:rFonts w:ascii="Times New Roman" w:hAnsi="Times New Roman" w:cs="Times New Roman" w:eastAsia="Times New Roman"/>
           <w:b w:val="0"/>
           <w:i/>
-          <w:sz w:val="18"/>
+          <w:sz w:val="20"/>
         </w:rPr>
         <w:t>(трите имена на упълномощен или законен представител на юридическото лице)</w:t>
       </w:r>
@@ -266,12 +431,21 @@
       </w:pPr>
       <w:r>
         <w:rPr>
-          <w:rFonts w:ascii="Times New Roman" w:hAnsi="Times New Roman" w:eastAsia="Times New Roman"/>
+          <w:rFonts w:ascii="Times New Roman" w:hAnsi="Times New Roman" w:cs="Times New Roman" w:eastAsia="Times New Roman"/>
           <w:b w:val="0"/>
           <w:i w:val="0"/>
-          <w:sz w:val="22"/>
+          <w:sz w:val="28"/>
         </w:rPr>
-        <w:t>e-mail: {{EMAIL}}</w:t>
+        <w:t xml:space="preserve">e-mail: </w:t>
+      </w:r>
+      <w:r>
+        <w:rPr>
+          <w:rFonts w:ascii="Times New Roman" w:hAnsi="Times New Roman" w:cs="Times New Roman" w:eastAsia="Times New Roman"/>
+          <w:b w:val="0"/>
+          <w:i w:val="0"/>
+          <w:sz w:val="28"/>
+        </w:rPr>
+        <w:t>{{EMAIL}}</w:t>
       </w:r>
     </w:p>
     <w:p>
@@ -280,10 +454,10 @@
       </w:pPr>
       <w:r>
         <w:rPr>
-          <w:rFonts w:ascii="Times New Roman" w:hAnsi="Times New Roman" w:eastAsia="Times New Roman"/>
+          <w:rFonts w:ascii="Times New Roman" w:hAnsi="Times New Roman" w:cs="Times New Roman" w:eastAsia="Times New Roman"/>
           <w:b/>
           <w:i w:val="0"/>
-          <w:sz w:val="22"/>
+          <w:sz w:val="28"/>
         </w:rPr>
         <w:t>УВАЖАЕМА ГОСПОЖО КМЕТ,</w:t>
       </w:r>
@@ -294,10 +468,10 @@
       </w:pPr>
       <w:r>
         <w:rPr>
-          <w:rFonts w:ascii="Times New Roman" w:hAnsi="Times New Roman" w:eastAsia="Times New Roman"/>
+          <w:rFonts w:ascii="Times New Roman" w:hAnsi="Times New Roman" w:cs="Times New Roman" w:eastAsia="Times New Roman"/>
           <w:b w:val="0"/>
           <w:i w:val="0"/>
-          <w:sz w:val="22"/>
+          <w:sz w:val="28"/>
         </w:rPr>
         <w:t>Заявявам желание за предоставяне за ползване на следното помещение в Многофункционална спортна зала „Троян“</w:t>
       </w:r>
@@ -308,12 +482,57 @@
       </w:pPr>
       <w:r>
         <w:rPr>
-          <w:rFonts w:ascii="Times New Roman" w:hAnsi="Times New Roman" w:eastAsia="Times New Roman"/>
+          <w:rFonts w:ascii="Times New Roman" w:hAnsi="Times New Roman" w:cs="Times New Roman" w:eastAsia="Times New Roman"/>
           <w:b w:val="0"/>
           <w:i w:val="0"/>
-          <w:sz w:val="22"/>
+          <w:sz w:val="28"/>
         </w:rPr>
-        <w:t>{{CHK_HALL_SPORT}} Спортна зала;   {{CHK_HALL_TRAIN}} Тренировъчна зала;  {{CHK_HALL_CONF}} Конферентна зала (30 места)</w:t>
+        <w:t>{{CHK_HALL_SPORT}}</w:t>
+      </w:r>
+      <w:r>
+        <w:rPr>
+          <w:rFonts w:ascii="Times New Roman" w:hAnsi="Times New Roman" w:cs="Times New Roman" w:eastAsia="Times New Roman"/>
+          <w:b w:val="0"/>
+          <w:i w:val="0"/>
+          <w:sz w:val="28"/>
+        </w:rPr>
+        <w:t xml:space="preserve"> Спортна зала;   </w:t>
+      </w:r>
+      <w:r>
+        <w:rPr>
+          <w:rFonts w:ascii="Times New Roman" w:hAnsi="Times New Roman" w:cs="Times New Roman" w:eastAsia="Times New Roman"/>
+          <w:b w:val="0"/>
+          <w:i w:val="0"/>
+          <w:sz w:val="28"/>
+        </w:rPr>
+        <w:t>{{CHK_HALL_TRAIN}}</w:t>
+      </w:r>
+      <w:r>
+        <w:rPr>
+          <w:rFonts w:ascii="Times New Roman" w:hAnsi="Times New Roman" w:cs="Times New Roman" w:eastAsia="Times New Roman"/>
+          <w:b w:val="0"/>
+          <w:i w:val="0"/>
+          <w:sz w:val="28"/>
+        </w:rPr>
+        <w:t xml:space="preserve"> Тренировъчна зала;  </w:t>
+      </w:r>
+      <w:r>
+        <w:rPr>
+          <w:rFonts w:ascii="Times New Roman" w:hAnsi="Times New Roman" w:cs="Times New Roman" w:eastAsia="Times New Roman"/>
+          <w:b w:val="0"/>
+          <w:i w:val="0"/>
+          <w:sz w:val="28"/>
+        </w:rPr>
+        <w:t>{{CHK_HALL_CONF}}</w:t>
+      </w:r>
+      <w:r>
+        <w:rPr>
+          <w:rFonts w:ascii="Times New Roman" w:hAnsi="Times New Roman" w:cs="Times New Roman" w:eastAsia="Times New Roman"/>
+          <w:b w:val="0"/>
+          <w:i w:val="0"/>
+          <w:sz w:val="28"/>
+        </w:rPr>
+        <w:t xml:space="preserve"> Конферентна зала (30 места)</w:t>
       </w:r>
     </w:p>
     <w:p>
@@ -322,12 +541,21 @@
       </w:pPr>
       <w:r>
         <w:rPr>
-          <w:rFonts w:ascii="Times New Roman" w:hAnsi="Times New Roman" w:eastAsia="Times New Roman"/>
+          <w:rFonts w:ascii="Times New Roman" w:hAnsi="Times New Roman" w:cs="Times New Roman" w:eastAsia="Times New Roman"/>
           <w:b w:val="0"/>
           <w:i w:val="0"/>
-          <w:sz w:val="22"/>
+          <w:sz w:val="28"/>
         </w:rPr>
-        <w:t>за провеждане на   {{EVENT_TITLE}}</w:t>
+        <w:t xml:space="preserve">за провеждане на   </w:t>
+      </w:r>
+      <w:r>
+        <w:rPr>
+          <w:rFonts w:ascii="Times New Roman" w:hAnsi="Times New Roman" w:cs="Times New Roman" w:eastAsia="Times New Roman"/>
+          <w:b w:val="0"/>
+          <w:i w:val="0"/>
+          <w:sz w:val="28"/>
+        </w:rPr>
+        <w:t>{{EVENT_TITLE}}</w:t>
       </w:r>
     </w:p>
     <w:p>
@@ -337,10 +565,10 @@
       </w:pPr>
       <w:r>
         <w:rPr>
-          <w:rFonts w:ascii="Times New Roman" w:hAnsi="Times New Roman" w:eastAsia="Times New Roman"/>
+          <w:rFonts w:ascii="Times New Roman" w:hAnsi="Times New Roman" w:cs="Times New Roman" w:eastAsia="Times New Roman"/>
           <w:b w:val="0"/>
           <w:i/>
-          <w:sz w:val="18"/>
+          <w:sz w:val="20"/>
         </w:rPr>
         <w:t>(наименование на събитието)</w:t>
       </w:r>
@@ -351,10 +579,10 @@
       </w:pPr>
       <w:r>
         <w:rPr>
-          <w:rFonts w:ascii="Times New Roman" w:hAnsi="Times New Roman" w:eastAsia="Times New Roman"/>
+          <w:rFonts w:ascii="Times New Roman" w:hAnsi="Times New Roman" w:cs="Times New Roman" w:eastAsia="Times New Roman"/>
           <w:b w:val="0"/>
           <w:i w:val="0"/>
-          <w:sz w:val="22"/>
+          <w:sz w:val="28"/>
         </w:rPr>
         <w:t>вид на събитието</w:t>
       </w:r>
@@ -365,12 +593,21 @@
       </w:pPr>
       <w:r>
         <w:rPr>
-          <w:rFonts w:ascii="Times New Roman" w:hAnsi="Times New Roman" w:eastAsia="Times New Roman"/>
+          <w:rFonts w:ascii="Times New Roman" w:hAnsi="Times New Roman" w:cs="Times New Roman" w:eastAsia="Times New Roman"/>
           <w:b w:val="0"/>
           <w:i w:val="0"/>
-          <w:sz w:val="22"/>
+          <w:sz w:val="28"/>
         </w:rPr>
-        <w:t>{{CHK_KIND_TRAIN}} Тренировки;</w:t>
+        <w:t>{{CHK_KIND_TRAIN}}</w:t>
+      </w:r>
+      <w:r>
+        <w:rPr>
+          <w:rFonts w:ascii="Times New Roman" w:hAnsi="Times New Roman" w:cs="Times New Roman" w:eastAsia="Times New Roman"/>
+          <w:b w:val="0"/>
+          <w:i w:val="0"/>
+          <w:sz w:val="28"/>
+        </w:rPr>
+        <w:t xml:space="preserve"> Тренировки;</w:t>
       </w:r>
     </w:p>
     <w:p>
@@ -379,12 +616,21 @@
       </w:pPr>
       <w:r>
         <w:rPr>
-          <w:rFonts w:ascii="Times New Roman" w:hAnsi="Times New Roman" w:eastAsia="Times New Roman"/>
+          <w:rFonts w:ascii="Times New Roman" w:hAnsi="Times New Roman" w:cs="Times New Roman" w:eastAsia="Times New Roman"/>
           <w:b w:val="0"/>
           <w:i w:val="0"/>
-          <w:sz w:val="22"/>
+          <w:sz w:val="28"/>
         </w:rPr>
-        <w:t>{{CHK_KIND_TOURN}} Спортни турнири/състезания;</w:t>
+        <w:t>{{CHK_KIND_TOURN}}</w:t>
+      </w:r>
+      <w:r>
+        <w:rPr>
+          <w:rFonts w:ascii="Times New Roman" w:hAnsi="Times New Roman" w:cs="Times New Roman" w:eastAsia="Times New Roman"/>
+          <w:b w:val="0"/>
+          <w:i w:val="0"/>
+          <w:sz w:val="28"/>
+        </w:rPr>
+        <w:t xml:space="preserve"> Спортни турнири/състезания;</w:t>
       </w:r>
     </w:p>
     <w:p>
@@ -393,12 +639,21 @@
       </w:pPr>
       <w:r>
         <w:rPr>
-          <w:rFonts w:ascii="Times New Roman" w:hAnsi="Times New Roman" w:eastAsia="Times New Roman"/>
+          <w:rFonts w:ascii="Times New Roman" w:hAnsi="Times New Roman" w:cs="Times New Roman" w:eastAsia="Times New Roman"/>
           <w:b w:val="0"/>
           <w:i w:val="0"/>
-          <w:sz w:val="22"/>
+          <w:sz w:val="28"/>
         </w:rPr>
-        <w:t>{{CHK_KIND_OTHER}} Образователни, културни или социални събития и дейности;</w:t>
+        <w:t>{{CHK_KIND_OTHER}}</w:t>
+      </w:r>
+      <w:r>
+        <w:rPr>
+          <w:rFonts w:ascii="Times New Roman" w:hAnsi="Times New Roman" w:cs="Times New Roman" w:eastAsia="Times New Roman"/>
+          <w:b w:val="0"/>
+          <w:i w:val="0"/>
+          <w:sz w:val="28"/>
+        </w:rPr>
+        <w:t xml:space="preserve"> Образователни, културни или социални събития и дейности;</w:t>
       </w:r>
     </w:p>
     <w:p>
@@ -407,10 +662,10 @@
       </w:pPr>
       <w:r>
         <w:rPr>
-          <w:rFonts w:ascii="Times New Roman" w:hAnsi="Times New Roman" w:eastAsia="Times New Roman"/>
+          <w:rFonts w:ascii="Times New Roman" w:hAnsi="Times New Roman" w:cs="Times New Roman" w:eastAsia="Times New Roman"/>
           <w:b w:val="0"/>
           <w:i w:val="0"/>
-          <w:sz w:val="22"/>
+          <w:sz w:val="28"/>
         </w:rPr>
         <w:t>дати и часове за ползване:</w:t>
       </w:r>
@@ -419,27 +674,31 @@
       <w:tblPr>
         <w:tblStyle w:val="TableGrid"/>
         <w:tblW w:type="auto" w:w="0"/>
+        <w:jc w:val="center"/>
         <w:tblLook w:firstColumn="1" w:firstRow="1" w:lastColumn="0" w:lastRow="0" w:noHBand="0" w:noVBand="1" w:val="04A0"/>
       </w:tblPr>
       <w:tblGrid>
-        <w:gridCol w:w="2493"/>
-        <w:gridCol w:w="2493"/>
-        <w:gridCol w:w="2493"/>
-        <w:gridCol w:w="2493"/>
+        <w:gridCol w:w="2409"/>
+        <w:gridCol w:w="2409"/>
+        <w:gridCol w:w="2409"/>
+        <w:gridCol w:w="2409"/>
       </w:tblGrid>
       <w:tr>
         <w:tc>
           <w:tcPr>
-            <w:tcW w:type="dxa" w:w="2493"/>
+            <w:tcW w:type="dxa" w:w="2409"/>
           </w:tcPr>
           <w:p>
+            <w:pPr>
+              <w:spacing w:before="0" w:after="0" w:line="240" w:lineRule="auto"/>
+            </w:pPr>
             <w:r/>
             <w:r>
               <w:rPr>
-                <w:rFonts w:ascii="Times New Roman" w:hAnsi="Times New Roman" w:eastAsia="Times New Roman"/>
+                <w:rFonts w:ascii="Times New Roman" w:hAnsi="Times New Roman" w:cs="Times New Roman" w:eastAsia="Times New Roman"/>
                 <w:b/>
                 <w:i w:val="0"/>
-                <w:sz w:val="18"/>
+                <w:sz w:val="20"/>
               </w:rPr>
               <w:t>Дата</w:t>
             </w:r>
@@ -447,16 +706,19 @@
         </w:tc>
         <w:tc>
           <w:tcPr>
-            <w:tcW w:type="dxa" w:w="2493"/>
+            <w:tcW w:type="dxa" w:w="2409"/>
           </w:tcPr>
           <w:p>
+            <w:pPr>
+              <w:spacing w:before="0" w:after="0" w:line="240" w:lineRule="auto"/>
+            </w:pPr>
             <w:r/>
             <w:r>
               <w:rPr>
-                <w:rFonts w:ascii="Times New Roman" w:hAnsi="Times New Roman" w:eastAsia="Times New Roman"/>
+                <w:rFonts w:ascii="Times New Roman" w:hAnsi="Times New Roman" w:cs="Times New Roman" w:eastAsia="Times New Roman"/>
                 <w:b/>
                 <w:i w:val="0"/>
-                <w:sz w:val="18"/>
+                <w:sz w:val="20"/>
               </w:rPr>
               <w:t>Начален час</w:t>
             </w:r>
@@ -464,16 +726,19 @@
         </w:tc>
         <w:tc>
           <w:tcPr>
-            <w:tcW w:type="dxa" w:w="2493"/>
+            <w:tcW w:type="dxa" w:w="2409"/>
           </w:tcPr>
           <w:p>
+            <w:pPr>
+              <w:spacing w:before="0" w:after="0" w:line="240" w:lineRule="auto"/>
+            </w:pPr>
             <w:r/>
             <w:r>
               <w:rPr>
-                <w:rFonts w:ascii="Times New Roman" w:hAnsi="Times New Roman" w:eastAsia="Times New Roman"/>
+                <w:rFonts w:ascii="Times New Roman" w:hAnsi="Times New Roman" w:cs="Times New Roman" w:eastAsia="Times New Roman"/>
                 <w:b/>
                 <w:i w:val="0"/>
-                <w:sz w:val="18"/>
+                <w:sz w:val="20"/>
               </w:rPr>
               <w:t>Краен час</w:t>
             </w:r>
@@ -481,16 +746,19 @@
         </w:tc>
         <w:tc>
           <w:tcPr>
-            <w:tcW w:type="dxa" w:w="2493"/>
+            <w:tcW w:type="dxa" w:w="2409"/>
           </w:tcPr>
           <w:p>
+            <w:pPr>
+              <w:spacing w:before="0" w:after="0" w:line="240" w:lineRule="auto"/>
+            </w:pPr>
             <w:r/>
             <w:r>
               <w:rPr>
-                <w:rFonts w:ascii="Times New Roman" w:hAnsi="Times New Roman" w:eastAsia="Times New Roman"/>
+                <w:rFonts w:ascii="Times New Roman" w:hAnsi="Times New Roman" w:cs="Times New Roman" w:eastAsia="Times New Roman"/>
                 <w:b/>
                 <w:i w:val="0"/>
-                <w:sz w:val="18"/>
+                <w:sz w:val="20"/>
               </w:rPr>
               <w:t>Целодневно ползване</w:t>
               <w:br/>
@@ -504,64 +772,76 @@
       <w:tr>
         <w:tc>
           <w:tcPr>
-            <w:tcW w:type="dxa" w:w="2493"/>
+            <w:tcW w:type="dxa" w:w="2409"/>
           </w:tcPr>
           <w:p>
+            <w:pPr>
+              <w:spacing w:before="0" w:after="0" w:line="240" w:lineRule="auto"/>
+            </w:pPr>
             <w:r/>
             <w:r>
               <w:rPr>
-                <w:rFonts w:ascii="Times New Roman" w:hAnsi="Times New Roman" w:eastAsia="Times New Roman"/>
+                <w:rFonts w:ascii="Times New Roman" w:hAnsi="Times New Roman" w:cs="Times New Roman" w:eastAsia="Times New Roman"/>
                 <w:b w:val="0"/>
                 <w:i w:val="0"/>
-                <w:sz w:val="20"/>
+                <w:sz w:val="28"/>
               </w:rPr>
             </w:r>
           </w:p>
         </w:tc>
         <w:tc>
           <w:tcPr>
-            <w:tcW w:type="dxa" w:w="2493"/>
+            <w:tcW w:type="dxa" w:w="2409"/>
           </w:tcPr>
           <w:p>
+            <w:pPr>
+              <w:spacing w:before="0" w:after="0" w:line="240" w:lineRule="auto"/>
+            </w:pPr>
             <w:r/>
             <w:r>
               <w:rPr>
-                <w:rFonts w:ascii="Times New Roman" w:hAnsi="Times New Roman" w:eastAsia="Times New Roman"/>
+                <w:rFonts w:ascii="Times New Roman" w:hAnsi="Times New Roman" w:cs="Times New Roman" w:eastAsia="Times New Roman"/>
                 <w:b w:val="0"/>
                 <w:i w:val="0"/>
-                <w:sz w:val="20"/>
+                <w:sz w:val="28"/>
               </w:rPr>
             </w:r>
           </w:p>
         </w:tc>
         <w:tc>
           <w:tcPr>
-            <w:tcW w:type="dxa" w:w="2493"/>
+            <w:tcW w:type="dxa" w:w="2409"/>
           </w:tcPr>
           <w:p>
+            <w:pPr>
+              <w:spacing w:before="0" w:after="0" w:line="240" w:lineRule="auto"/>
+            </w:pPr>
             <w:r/>
             <w:r>
               <w:rPr>
-                <w:rFonts w:ascii="Times New Roman" w:hAnsi="Times New Roman" w:eastAsia="Times New Roman"/>
+                <w:rFonts w:ascii="Times New Roman" w:hAnsi="Times New Roman" w:cs="Times New Roman" w:eastAsia="Times New Roman"/>
                 <w:b w:val="0"/>
                 <w:i w:val="0"/>
-                <w:sz w:val="20"/>
+                <w:sz w:val="28"/>
               </w:rPr>
             </w:r>
           </w:p>
         </w:tc>
         <w:tc>
           <w:tcPr>
-            <w:tcW w:type="dxa" w:w="2493"/>
+            <w:tcW w:type="dxa" w:w="2409"/>
           </w:tcPr>
           <w:p>
+            <w:pPr>
+              <w:spacing w:before="0" w:after="0" w:line="240" w:lineRule="auto"/>
+            </w:pPr>
             <w:r/>
             <w:r>
               <w:rPr>
-                <w:rFonts w:ascii="Times New Roman" w:hAnsi="Times New Roman" w:eastAsia="Times New Roman"/>
+                <w:rFonts w:ascii="Times New Roman" w:hAnsi="Times New Roman" w:cs="Times New Roman" w:eastAsia="Times New Roman"/>
                 <w:b w:val="0"/>
                 <w:i w:val="0"/>
-                <w:sz w:val="20"/>
+                <w:sz w:val="28"/>
               </w:rPr>
               <w:t>☐</w:t>
             </w:r>
@@ -571,64 +851,76 @@
       <w:tr>
         <w:tc>
           <w:tcPr>
-            <w:tcW w:type="dxa" w:w="2493"/>
+            <w:tcW w:type="dxa" w:w="2409"/>
           </w:tcPr>
           <w:p>
+            <w:pPr>
+              <w:spacing w:before="0" w:after="0" w:line="240" w:lineRule="auto"/>
+            </w:pPr>
             <w:r/>
             <w:r>
               <w:rPr>
-                <w:rFonts w:ascii="Times New Roman" w:hAnsi="Times New Roman" w:eastAsia="Times New Roman"/>
+                <w:rFonts w:ascii="Times New Roman" w:hAnsi="Times New Roman" w:cs="Times New Roman" w:eastAsia="Times New Roman"/>
                 <w:b w:val="0"/>
                 <w:i w:val="0"/>
-                <w:sz w:val="20"/>
+                <w:sz w:val="28"/>
               </w:rPr>
             </w:r>
           </w:p>
         </w:tc>
         <w:tc>
           <w:tcPr>
-            <w:tcW w:type="dxa" w:w="2493"/>
+            <w:tcW w:type="dxa" w:w="2409"/>
           </w:tcPr>
           <w:p>
+            <w:pPr>
+              <w:spacing w:before="0" w:after="0" w:line="240" w:lineRule="auto"/>
+            </w:pPr>
             <w:r/>
             <w:r>
               <w:rPr>
-                <w:rFonts w:ascii="Times New Roman" w:hAnsi="Times New Roman" w:eastAsia="Times New Roman"/>
+                <w:rFonts w:ascii="Times New Roman" w:hAnsi="Times New Roman" w:cs="Times New Roman" w:eastAsia="Times New Roman"/>
                 <w:b w:val="0"/>
                 <w:i w:val="0"/>
-                <w:sz w:val="20"/>
+                <w:sz w:val="28"/>
               </w:rPr>
             </w:r>
           </w:p>
         </w:tc>
         <w:tc>
           <w:tcPr>
-            <w:tcW w:type="dxa" w:w="2493"/>
+            <w:tcW w:type="dxa" w:w="2409"/>
           </w:tcPr>
           <w:p>
+            <w:pPr>
+              <w:spacing w:before="0" w:after="0" w:line="240" w:lineRule="auto"/>
+            </w:pPr>
             <w:r/>
             <w:r>
               <w:rPr>
-                <w:rFonts w:ascii="Times New Roman" w:hAnsi="Times New Roman" w:eastAsia="Times New Roman"/>
+                <w:rFonts w:ascii="Times New Roman" w:hAnsi="Times New Roman" w:cs="Times New Roman" w:eastAsia="Times New Roman"/>
                 <w:b w:val="0"/>
                 <w:i w:val="0"/>
-                <w:sz w:val="20"/>
+                <w:sz w:val="28"/>
               </w:rPr>
             </w:r>
           </w:p>
         </w:tc>
         <w:tc>
           <w:tcPr>
-            <w:tcW w:type="dxa" w:w="2493"/>
+            <w:tcW w:type="dxa" w:w="2409"/>
           </w:tcPr>
           <w:p>
+            <w:pPr>
+              <w:spacing w:before="0" w:after="0" w:line="240" w:lineRule="auto"/>
+            </w:pPr>
             <w:r/>
             <w:r>
               <w:rPr>
-                <w:rFonts w:ascii="Times New Roman" w:hAnsi="Times New Roman" w:eastAsia="Times New Roman"/>
+                <w:rFonts w:ascii="Times New Roman" w:hAnsi="Times New Roman" w:cs="Times New Roman" w:eastAsia="Times New Roman"/>
                 <w:b w:val="0"/>
                 <w:i w:val="0"/>
-                <w:sz w:val="20"/>
+                <w:sz w:val="28"/>
               </w:rPr>
               <w:t>☐</w:t>
             </w:r>
@@ -638,64 +930,76 @@
       <w:tr>
         <w:tc>
           <w:tcPr>
-            <w:tcW w:type="dxa" w:w="2493"/>
+            <w:tcW w:type="dxa" w:w="2409"/>
           </w:tcPr>
           <w:p>
+            <w:pPr>
+              <w:spacing w:before="0" w:after="0" w:line="240" w:lineRule="auto"/>
+            </w:pPr>
             <w:r/>
             <w:r>
               <w:rPr>
-                <w:rFonts w:ascii="Times New Roman" w:hAnsi="Times New Roman" w:eastAsia="Times New Roman"/>
+                <w:rFonts w:ascii="Times New Roman" w:hAnsi="Times New Roman" w:cs="Times New Roman" w:eastAsia="Times New Roman"/>
                 <w:b w:val="0"/>
                 <w:i w:val="0"/>
-                <w:sz w:val="20"/>
+                <w:sz w:val="28"/>
               </w:rPr>
             </w:r>
           </w:p>
         </w:tc>
         <w:tc>
           <w:tcPr>
-            <w:tcW w:type="dxa" w:w="2493"/>
+            <w:tcW w:type="dxa" w:w="2409"/>
           </w:tcPr>
           <w:p>
+            <w:pPr>
+              <w:spacing w:before="0" w:after="0" w:line="240" w:lineRule="auto"/>
+            </w:pPr>
             <w:r/>
             <w:r>
               <w:rPr>
-                <w:rFonts w:ascii="Times New Roman" w:hAnsi="Times New Roman" w:eastAsia="Times New Roman"/>
+                <w:rFonts w:ascii="Times New Roman" w:hAnsi="Times New Roman" w:cs="Times New Roman" w:eastAsia="Times New Roman"/>
                 <w:b w:val="0"/>
                 <w:i w:val="0"/>
-                <w:sz w:val="20"/>
+                <w:sz w:val="28"/>
               </w:rPr>
             </w:r>
           </w:p>
         </w:tc>
         <w:tc>
           <w:tcPr>
-            <w:tcW w:type="dxa" w:w="2493"/>
+            <w:tcW w:type="dxa" w:w="2409"/>
           </w:tcPr>
           <w:p>
+            <w:pPr>
+              <w:spacing w:before="0" w:after="0" w:line="240" w:lineRule="auto"/>
+            </w:pPr>
             <w:r/>
             <w:r>
               <w:rPr>
-                <w:rFonts w:ascii="Times New Roman" w:hAnsi="Times New Roman" w:eastAsia="Times New Roman"/>
+                <w:rFonts w:ascii="Times New Roman" w:hAnsi="Times New Roman" w:cs="Times New Roman" w:eastAsia="Times New Roman"/>
                 <w:b w:val="0"/>
                 <w:i w:val="0"/>
-                <w:sz w:val="20"/>
+                <w:sz w:val="28"/>
               </w:rPr>
             </w:r>
           </w:p>
         </w:tc>
         <w:tc>
           <w:tcPr>
-            <w:tcW w:type="dxa" w:w="2493"/>
+            <w:tcW w:type="dxa" w:w="2409"/>
           </w:tcPr>
           <w:p>
+            <w:pPr>
+              <w:spacing w:before="0" w:after="0" w:line="240" w:lineRule="auto"/>
+            </w:pPr>
             <w:r/>
             <w:r>
               <w:rPr>
-                <w:rFonts w:ascii="Times New Roman" w:hAnsi="Times New Roman" w:eastAsia="Times New Roman"/>
+                <w:rFonts w:ascii="Times New Roman" w:hAnsi="Times New Roman" w:cs="Times New Roman" w:eastAsia="Times New Roman"/>
                 <w:b w:val="0"/>
                 <w:i w:val="0"/>
-                <w:sz w:val="20"/>
+                <w:sz w:val="28"/>
               </w:rPr>
               <w:t>☐</w:t>
             </w:r>
@@ -705,64 +1009,76 @@
       <w:tr>
         <w:tc>
           <w:tcPr>
-            <w:tcW w:type="dxa" w:w="2493"/>
+            <w:tcW w:type="dxa" w:w="2409"/>
           </w:tcPr>
           <w:p>
+            <w:pPr>
+              <w:spacing w:before="0" w:after="0" w:line="240" w:lineRule="auto"/>
+            </w:pPr>
             <w:r/>
             <w:r>
               <w:rPr>
-                <w:rFonts w:ascii="Times New Roman" w:hAnsi="Times New Roman" w:eastAsia="Times New Roman"/>
+                <w:rFonts w:ascii="Times New Roman" w:hAnsi="Times New Roman" w:cs="Times New Roman" w:eastAsia="Times New Roman"/>
                 <w:b w:val="0"/>
                 <w:i w:val="0"/>
-                <w:sz w:val="20"/>
+                <w:sz w:val="28"/>
               </w:rPr>
             </w:r>
           </w:p>
         </w:tc>
         <w:tc>
           <w:tcPr>
-            <w:tcW w:type="dxa" w:w="2493"/>
+            <w:tcW w:type="dxa" w:w="2409"/>
           </w:tcPr>
           <w:p>
+            <w:pPr>
+              <w:spacing w:before="0" w:after="0" w:line="240" w:lineRule="auto"/>
+            </w:pPr>
             <w:r/>
             <w:r>
               <w:rPr>
-                <w:rFonts w:ascii="Times New Roman" w:hAnsi="Times New Roman" w:eastAsia="Times New Roman"/>
+                <w:rFonts w:ascii="Times New Roman" w:hAnsi="Times New Roman" w:cs="Times New Roman" w:eastAsia="Times New Roman"/>
                 <w:b w:val="0"/>
                 <w:i w:val="0"/>
-                <w:sz w:val="20"/>
+                <w:sz w:val="28"/>
               </w:rPr>
             </w:r>
           </w:p>
         </w:tc>
         <w:tc>
           <w:tcPr>
-            <w:tcW w:type="dxa" w:w="2493"/>
+            <w:tcW w:type="dxa" w:w="2409"/>
           </w:tcPr>
           <w:p>
+            <w:pPr>
+              <w:spacing w:before="0" w:after="0" w:line="240" w:lineRule="auto"/>
+            </w:pPr>
             <w:r/>
             <w:r>
               <w:rPr>
-                <w:rFonts w:ascii="Times New Roman" w:hAnsi="Times New Roman" w:eastAsia="Times New Roman"/>
+                <w:rFonts w:ascii="Times New Roman" w:hAnsi="Times New Roman" w:cs="Times New Roman" w:eastAsia="Times New Roman"/>
                 <w:b w:val="0"/>
                 <w:i w:val="0"/>
-                <w:sz w:val="20"/>
+                <w:sz w:val="28"/>
               </w:rPr>
             </w:r>
           </w:p>
         </w:tc>
         <w:tc>
           <w:tcPr>
-            <w:tcW w:type="dxa" w:w="2493"/>
+            <w:tcW w:type="dxa" w:w="2409"/>
           </w:tcPr>
           <w:p>
+            <w:pPr>
+              <w:spacing w:before="0" w:after="0" w:line="240" w:lineRule="auto"/>
+            </w:pPr>
             <w:r/>
             <w:r>
               <w:rPr>
-                <w:rFonts w:ascii="Times New Roman" w:hAnsi="Times New Roman" w:eastAsia="Times New Roman"/>
+                <w:rFonts w:ascii="Times New Roman" w:hAnsi="Times New Roman" w:cs="Times New Roman" w:eastAsia="Times New Roman"/>
                 <w:b w:val="0"/>
                 <w:i w:val="0"/>
-                <w:sz w:val="20"/>
+                <w:sz w:val="28"/>
               </w:rPr>
               <w:t>☐</w:t>
             </w:r>
@@ -772,64 +1088,76 @@
       <w:tr>
         <w:tc>
           <w:tcPr>
-            <w:tcW w:type="dxa" w:w="2493"/>
+            <w:tcW w:type="dxa" w:w="2409"/>
           </w:tcPr>
           <w:p>
+            <w:pPr>
+              <w:spacing w:before="0" w:after="0" w:line="240" w:lineRule="auto"/>
+            </w:pPr>
             <w:r/>
             <w:r>
               <w:rPr>
-                <w:rFonts w:ascii="Times New Roman" w:hAnsi="Times New Roman" w:eastAsia="Times New Roman"/>
+                <w:rFonts w:ascii="Times New Roman" w:hAnsi="Times New Roman" w:cs="Times New Roman" w:eastAsia="Times New Roman"/>
                 <w:b w:val="0"/>
                 <w:i w:val="0"/>
-                <w:sz w:val="20"/>
+                <w:sz w:val="28"/>
               </w:rPr>
             </w:r>
           </w:p>
         </w:tc>
         <w:tc>
           <w:tcPr>
-            <w:tcW w:type="dxa" w:w="2493"/>
+            <w:tcW w:type="dxa" w:w="2409"/>
           </w:tcPr>
           <w:p>
+            <w:pPr>
+              <w:spacing w:before="0" w:after="0" w:line="240" w:lineRule="auto"/>
+            </w:pPr>
             <w:r/>
             <w:r>
               <w:rPr>
-                <w:rFonts w:ascii="Times New Roman" w:hAnsi="Times New Roman" w:eastAsia="Times New Roman"/>
+                <w:rFonts w:ascii="Times New Roman" w:hAnsi="Times New Roman" w:cs="Times New Roman" w:eastAsia="Times New Roman"/>
                 <w:b w:val="0"/>
                 <w:i w:val="0"/>
-                <w:sz w:val="20"/>
+                <w:sz w:val="28"/>
               </w:rPr>
             </w:r>
           </w:p>
         </w:tc>
         <w:tc>
           <w:tcPr>
-            <w:tcW w:type="dxa" w:w="2493"/>
+            <w:tcW w:type="dxa" w:w="2409"/>
           </w:tcPr>
           <w:p>
+            <w:pPr>
+              <w:spacing w:before="0" w:after="0" w:line="240" w:lineRule="auto"/>
+            </w:pPr>
             <w:r/>
             <w:r>
               <w:rPr>
-                <w:rFonts w:ascii="Times New Roman" w:hAnsi="Times New Roman" w:eastAsia="Times New Roman"/>
+                <w:rFonts w:ascii="Times New Roman" w:hAnsi="Times New Roman" w:cs="Times New Roman" w:eastAsia="Times New Roman"/>
                 <w:b w:val="0"/>
                 <w:i w:val="0"/>
-                <w:sz w:val="20"/>
+                <w:sz w:val="28"/>
               </w:rPr>
             </w:r>
           </w:p>
         </w:tc>
         <w:tc>
           <w:tcPr>
-            <w:tcW w:type="dxa" w:w="2493"/>
+            <w:tcW w:type="dxa" w:w="2409"/>
           </w:tcPr>
           <w:p>
+            <w:pPr>
+              <w:spacing w:before="0" w:after="0" w:line="240" w:lineRule="auto"/>
+            </w:pPr>
             <w:r/>
             <w:r>
               <w:rPr>
-                <w:rFonts w:ascii="Times New Roman" w:hAnsi="Times New Roman" w:eastAsia="Times New Roman"/>
+                <w:rFonts w:ascii="Times New Roman" w:hAnsi="Times New Roman" w:cs="Times New Roman" w:eastAsia="Times New Roman"/>
                 <w:b w:val="0"/>
                 <w:i w:val="0"/>
-                <w:sz w:val="20"/>
+                <w:sz w:val="28"/>
               </w:rPr>
               <w:t>☐</w:t>
             </w:r>
@@ -839,64 +1167,76 @@
       <w:tr>
         <w:tc>
           <w:tcPr>
-            <w:tcW w:type="dxa" w:w="2493"/>
+            <w:tcW w:type="dxa" w:w="2409"/>
           </w:tcPr>
           <w:p>
+            <w:pPr>
+              <w:spacing w:before="0" w:after="0" w:line="240" w:lineRule="auto"/>
+            </w:pPr>
             <w:r/>
             <w:r>
               <w:rPr>
-                <w:rFonts w:ascii="Times New Roman" w:hAnsi="Times New Roman" w:eastAsia="Times New Roman"/>
+                <w:rFonts w:ascii="Times New Roman" w:hAnsi="Times New Roman" w:cs="Times New Roman" w:eastAsia="Times New Roman"/>
                 <w:b w:val="0"/>
                 <w:i w:val="0"/>
-                <w:sz w:val="20"/>
+                <w:sz w:val="28"/>
               </w:rPr>
             </w:r>
           </w:p>
         </w:tc>
         <w:tc>
           <w:tcPr>
-            <w:tcW w:type="dxa" w:w="2493"/>
+            <w:tcW w:type="dxa" w:w="2409"/>
           </w:tcPr>
           <w:p>
+            <w:pPr>
+              <w:spacing w:before="0" w:after="0" w:line="240" w:lineRule="auto"/>
+            </w:pPr>
             <w:r/>
             <w:r>
               <w:rPr>
-                <w:rFonts w:ascii="Times New Roman" w:hAnsi="Times New Roman" w:eastAsia="Times New Roman"/>
+                <w:rFonts w:ascii="Times New Roman" w:hAnsi="Times New Roman" w:cs="Times New Roman" w:eastAsia="Times New Roman"/>
                 <w:b w:val="0"/>
                 <w:i w:val="0"/>
-                <w:sz w:val="20"/>
+                <w:sz w:val="28"/>
               </w:rPr>
             </w:r>
           </w:p>
         </w:tc>
         <w:tc>
           <w:tcPr>
-            <w:tcW w:type="dxa" w:w="2493"/>
+            <w:tcW w:type="dxa" w:w="2409"/>
           </w:tcPr>
           <w:p>
+            <w:pPr>
+              <w:spacing w:before="0" w:after="0" w:line="240" w:lineRule="auto"/>
+            </w:pPr>
             <w:r/>
             <w:r>
               <w:rPr>
-                <w:rFonts w:ascii="Times New Roman" w:hAnsi="Times New Roman" w:eastAsia="Times New Roman"/>
+                <w:rFonts w:ascii="Times New Roman" w:hAnsi="Times New Roman" w:cs="Times New Roman" w:eastAsia="Times New Roman"/>
                 <w:b w:val="0"/>
                 <w:i w:val="0"/>
-                <w:sz w:val="20"/>
+                <w:sz w:val="28"/>
               </w:rPr>
             </w:r>
           </w:p>
         </w:tc>
         <w:tc>
           <w:tcPr>
-            <w:tcW w:type="dxa" w:w="2493"/>
+            <w:tcW w:type="dxa" w:w="2409"/>
           </w:tcPr>
           <w:p>
+            <w:pPr>
+              <w:spacing w:before="0" w:after="0" w:line="240" w:lineRule="auto"/>
+            </w:pPr>
             <w:r/>
             <w:r>
               <w:rPr>
-                <w:rFonts w:ascii="Times New Roman" w:hAnsi="Times New Roman" w:eastAsia="Times New Roman"/>
+                <w:rFonts w:ascii="Times New Roman" w:hAnsi="Times New Roman" w:cs="Times New Roman" w:eastAsia="Times New Roman"/>
                 <w:b w:val="0"/>
                 <w:i w:val="0"/>
-                <w:sz w:val="20"/>
+                <w:sz w:val="28"/>
               </w:rPr>
               <w:t>☐</w:t>
             </w:r>
@@ -906,64 +1246,76 @@
       <w:tr>
         <w:tc>
           <w:tcPr>
-            <w:tcW w:type="dxa" w:w="2493"/>
+            <w:tcW w:type="dxa" w:w="2409"/>
           </w:tcPr>
           <w:p>
+            <w:pPr>
+              <w:spacing w:before="0" w:after="0" w:line="240" w:lineRule="auto"/>
+            </w:pPr>
             <w:r/>
             <w:r>
               <w:rPr>
-                <w:rFonts w:ascii="Times New Roman" w:hAnsi="Times New Roman" w:eastAsia="Times New Roman"/>
+                <w:rFonts w:ascii="Times New Roman" w:hAnsi="Times New Roman" w:cs="Times New Roman" w:eastAsia="Times New Roman"/>
                 <w:b w:val="0"/>
                 <w:i w:val="0"/>
-                <w:sz w:val="20"/>
+                <w:sz w:val="28"/>
               </w:rPr>
             </w:r>
           </w:p>
         </w:tc>
         <w:tc>
           <w:tcPr>
-            <w:tcW w:type="dxa" w:w="2493"/>
+            <w:tcW w:type="dxa" w:w="2409"/>
           </w:tcPr>
           <w:p>
+            <w:pPr>
+              <w:spacing w:before="0" w:after="0" w:line="240" w:lineRule="auto"/>
+            </w:pPr>
             <w:r/>
             <w:r>
               <w:rPr>
-                <w:rFonts w:ascii="Times New Roman" w:hAnsi="Times New Roman" w:eastAsia="Times New Roman"/>
+                <w:rFonts w:ascii="Times New Roman" w:hAnsi="Times New Roman" w:cs="Times New Roman" w:eastAsia="Times New Roman"/>
                 <w:b w:val="0"/>
                 <w:i w:val="0"/>
-                <w:sz w:val="20"/>
+                <w:sz w:val="28"/>
               </w:rPr>
             </w:r>
           </w:p>
         </w:tc>
         <w:tc>
           <w:tcPr>
-            <w:tcW w:type="dxa" w:w="2493"/>
+            <w:tcW w:type="dxa" w:w="2409"/>
           </w:tcPr>
           <w:p>
+            <w:pPr>
+              <w:spacing w:before="0" w:after="0" w:line="240" w:lineRule="auto"/>
+            </w:pPr>
             <w:r/>
             <w:r>
               <w:rPr>
-                <w:rFonts w:ascii="Times New Roman" w:hAnsi="Times New Roman" w:eastAsia="Times New Roman"/>
+                <w:rFonts w:ascii="Times New Roman" w:hAnsi="Times New Roman" w:cs="Times New Roman" w:eastAsia="Times New Roman"/>
                 <w:b w:val="0"/>
                 <w:i w:val="0"/>
-                <w:sz w:val="20"/>
+                <w:sz w:val="28"/>
               </w:rPr>
             </w:r>
           </w:p>
         </w:tc>
         <w:tc>
           <w:tcPr>
-            <w:tcW w:type="dxa" w:w="2493"/>
+            <w:tcW w:type="dxa" w:w="2409"/>
           </w:tcPr>
           <w:p>
+            <w:pPr>
+              <w:spacing w:before="0" w:after="0" w:line="240" w:lineRule="auto"/>
+            </w:pPr>
             <w:r/>
             <w:r>
               <w:rPr>
-                <w:rFonts w:ascii="Times New Roman" w:hAnsi="Times New Roman" w:eastAsia="Times New Roman"/>
+                <w:rFonts w:ascii="Times New Roman" w:hAnsi="Times New Roman" w:cs="Times New Roman" w:eastAsia="Times New Roman"/>
                 <w:b w:val="0"/>
                 <w:i w:val="0"/>
-                <w:sz w:val="20"/>
+                <w:sz w:val="28"/>
               </w:rPr>
               <w:t>☐</w:t>
             </w:r>
@@ -973,64 +1325,76 @@
       <w:tr>
         <w:tc>
           <w:tcPr>
-            <w:tcW w:type="dxa" w:w="2493"/>
+            <w:tcW w:type="dxa" w:w="2409"/>
           </w:tcPr>
           <w:p>
+            <w:pPr>
+              <w:spacing w:before="0" w:after="0" w:line="240" w:lineRule="auto"/>
+            </w:pPr>
             <w:r/>
             <w:r>
               <w:rPr>
-                <w:rFonts w:ascii="Times New Roman" w:hAnsi="Times New Roman" w:eastAsia="Times New Roman"/>
+                <w:rFonts w:ascii="Times New Roman" w:hAnsi="Times New Roman" w:cs="Times New Roman" w:eastAsia="Times New Roman"/>
                 <w:b w:val="0"/>
                 <w:i w:val="0"/>
-                <w:sz w:val="20"/>
+                <w:sz w:val="28"/>
               </w:rPr>
             </w:r>
           </w:p>
         </w:tc>
         <w:tc>
           <w:tcPr>
-            <w:tcW w:type="dxa" w:w="2493"/>
+            <w:tcW w:type="dxa" w:w="2409"/>
           </w:tcPr>
           <w:p>
+            <w:pPr>
+              <w:spacing w:before="0" w:after="0" w:line="240" w:lineRule="auto"/>
+            </w:pPr>
             <w:r/>
             <w:r>
               <w:rPr>
-                <w:rFonts w:ascii="Times New Roman" w:hAnsi="Times New Roman" w:eastAsia="Times New Roman"/>
+                <w:rFonts w:ascii="Times New Roman" w:hAnsi="Times New Roman" w:cs="Times New Roman" w:eastAsia="Times New Roman"/>
                 <w:b w:val="0"/>
                 <w:i w:val="0"/>
-                <w:sz w:val="20"/>
+                <w:sz w:val="28"/>
               </w:rPr>
             </w:r>
           </w:p>
         </w:tc>
         <w:tc>
           <w:tcPr>
-            <w:tcW w:type="dxa" w:w="2493"/>
+            <w:tcW w:type="dxa" w:w="2409"/>
           </w:tcPr>
           <w:p>
+            <w:pPr>
+              <w:spacing w:before="0" w:after="0" w:line="240" w:lineRule="auto"/>
+            </w:pPr>
             <w:r/>
             <w:r>
               <w:rPr>
-                <w:rFonts w:ascii="Times New Roman" w:hAnsi="Times New Roman" w:eastAsia="Times New Roman"/>
+                <w:rFonts w:ascii="Times New Roman" w:hAnsi="Times New Roman" w:cs="Times New Roman" w:eastAsia="Times New Roman"/>
                 <w:b w:val="0"/>
                 <w:i w:val="0"/>
-                <w:sz w:val="20"/>
+                <w:sz w:val="28"/>
               </w:rPr>
             </w:r>
           </w:p>
         </w:tc>
         <w:tc>
           <w:tcPr>
-            <w:tcW w:type="dxa" w:w="2493"/>
+            <w:tcW w:type="dxa" w:w="2409"/>
           </w:tcPr>
           <w:p>
+            <w:pPr>
+              <w:spacing w:before="0" w:after="0" w:line="240" w:lineRule="auto"/>
+            </w:pPr>
             <w:r/>
             <w:r>
               <w:rPr>
-                <w:rFonts w:ascii="Times New Roman" w:hAnsi="Times New Roman" w:eastAsia="Times New Roman"/>
+                <w:rFonts w:ascii="Times New Roman" w:hAnsi="Times New Roman" w:cs="Times New Roman" w:eastAsia="Times New Roman"/>
                 <w:b w:val="0"/>
                 <w:i w:val="0"/>
-                <w:sz w:val="20"/>
+                <w:sz w:val="28"/>
               </w:rPr>
               <w:t>☐</w:t>
             </w:r>
@@ -1040,64 +1404,76 @@
       <w:tr>
         <w:tc>
           <w:tcPr>
-            <w:tcW w:type="dxa" w:w="2493"/>
+            <w:tcW w:type="dxa" w:w="2409"/>
           </w:tcPr>
           <w:p>
+            <w:pPr>
+              <w:spacing w:before="0" w:after="0" w:line="240" w:lineRule="auto"/>
+            </w:pPr>
             <w:r/>
             <w:r>
               <w:rPr>
-                <w:rFonts w:ascii="Times New Roman" w:hAnsi="Times New Roman" w:eastAsia="Times New Roman"/>
+                <w:rFonts w:ascii="Times New Roman" w:hAnsi="Times New Roman" w:cs="Times New Roman" w:eastAsia="Times New Roman"/>
                 <w:b w:val="0"/>
                 <w:i w:val="0"/>
-                <w:sz w:val="20"/>
+                <w:sz w:val="28"/>
               </w:rPr>
             </w:r>
           </w:p>
         </w:tc>
         <w:tc>
           <w:tcPr>
-            <w:tcW w:type="dxa" w:w="2493"/>
+            <w:tcW w:type="dxa" w:w="2409"/>
           </w:tcPr>
           <w:p>
+            <w:pPr>
+              <w:spacing w:before="0" w:after="0" w:line="240" w:lineRule="auto"/>
+            </w:pPr>
             <w:r/>
             <w:r>
               <w:rPr>
-                <w:rFonts w:ascii="Times New Roman" w:hAnsi="Times New Roman" w:eastAsia="Times New Roman"/>
+                <w:rFonts w:ascii="Times New Roman" w:hAnsi="Times New Roman" w:cs="Times New Roman" w:eastAsia="Times New Roman"/>
                 <w:b w:val="0"/>
                 <w:i w:val="0"/>
-                <w:sz w:val="20"/>
+                <w:sz w:val="28"/>
               </w:rPr>
             </w:r>
           </w:p>
         </w:tc>
         <w:tc>
           <w:tcPr>
-            <w:tcW w:type="dxa" w:w="2493"/>
+            <w:tcW w:type="dxa" w:w="2409"/>
           </w:tcPr>
           <w:p>
+            <w:pPr>
+              <w:spacing w:before="0" w:after="0" w:line="240" w:lineRule="auto"/>
+            </w:pPr>
             <w:r/>
             <w:r>
               <w:rPr>
-                <w:rFonts w:ascii="Times New Roman" w:hAnsi="Times New Roman" w:eastAsia="Times New Roman"/>
+                <w:rFonts w:ascii="Times New Roman" w:hAnsi="Times New Roman" w:cs="Times New Roman" w:eastAsia="Times New Roman"/>
                 <w:b w:val="0"/>
                 <w:i w:val="0"/>
-                <w:sz w:val="20"/>
+                <w:sz w:val="28"/>
               </w:rPr>
             </w:r>
           </w:p>
         </w:tc>
         <w:tc>
           <w:tcPr>
-            <w:tcW w:type="dxa" w:w="2493"/>
+            <w:tcW w:type="dxa" w:w="2409"/>
           </w:tcPr>
           <w:p>
+            <w:pPr>
+              <w:spacing w:before="0" w:after="0" w:line="240" w:lineRule="auto"/>
+            </w:pPr>
             <w:r/>
             <w:r>
               <w:rPr>
-                <w:rFonts w:ascii="Times New Roman" w:hAnsi="Times New Roman" w:eastAsia="Times New Roman"/>
+                <w:rFonts w:ascii="Times New Roman" w:hAnsi="Times New Roman" w:cs="Times New Roman" w:eastAsia="Times New Roman"/>
                 <w:b w:val="0"/>
                 <w:i w:val="0"/>
-                <w:sz w:val="20"/>
+                <w:sz w:val="28"/>
               </w:rPr>
               <w:t>☐</w:t>
             </w:r>
@@ -1107,64 +1483,76 @@
       <w:tr>
         <w:tc>
           <w:tcPr>
-            <w:tcW w:type="dxa" w:w="2493"/>
+            <w:tcW w:type="dxa" w:w="2409"/>
           </w:tcPr>
           <w:p>
+            <w:pPr>
+              <w:spacing w:before="0" w:after="0" w:line="240" w:lineRule="auto"/>
+            </w:pPr>
             <w:r/>
             <w:r>
               <w:rPr>
-                <w:rFonts w:ascii="Times New Roman" w:hAnsi="Times New Roman" w:eastAsia="Times New Roman"/>
+                <w:rFonts w:ascii="Times New Roman" w:hAnsi="Times New Roman" w:cs="Times New Roman" w:eastAsia="Times New Roman"/>
                 <w:b w:val="0"/>
                 <w:i w:val="0"/>
-                <w:sz w:val="20"/>
+                <w:sz w:val="28"/>
               </w:rPr>
             </w:r>
           </w:p>
         </w:tc>
         <w:tc>
           <w:tcPr>
-            <w:tcW w:type="dxa" w:w="2493"/>
+            <w:tcW w:type="dxa" w:w="2409"/>
           </w:tcPr>
           <w:p>
+            <w:pPr>
+              <w:spacing w:before="0" w:after="0" w:line="240" w:lineRule="auto"/>
+            </w:pPr>
             <w:r/>
             <w:r>
               <w:rPr>
-                <w:rFonts w:ascii="Times New Roman" w:hAnsi="Times New Roman" w:eastAsia="Times New Roman"/>
+                <w:rFonts w:ascii="Times New Roman" w:hAnsi="Times New Roman" w:cs="Times New Roman" w:eastAsia="Times New Roman"/>
                 <w:b w:val="0"/>
                 <w:i w:val="0"/>
-                <w:sz w:val="20"/>
+                <w:sz w:val="28"/>
               </w:rPr>
             </w:r>
           </w:p>
         </w:tc>
         <w:tc>
           <w:tcPr>
-            <w:tcW w:type="dxa" w:w="2493"/>
+            <w:tcW w:type="dxa" w:w="2409"/>
           </w:tcPr>
           <w:p>
+            <w:pPr>
+              <w:spacing w:before="0" w:after="0" w:line="240" w:lineRule="auto"/>
+            </w:pPr>
             <w:r/>
             <w:r>
               <w:rPr>
-                <w:rFonts w:ascii="Times New Roman" w:hAnsi="Times New Roman" w:eastAsia="Times New Roman"/>
+                <w:rFonts w:ascii="Times New Roman" w:hAnsi="Times New Roman" w:cs="Times New Roman" w:eastAsia="Times New Roman"/>
                 <w:b w:val="0"/>
                 <w:i w:val="0"/>
-                <w:sz w:val="20"/>
+                <w:sz w:val="28"/>
               </w:rPr>
             </w:r>
           </w:p>
         </w:tc>
         <w:tc>
           <w:tcPr>
-            <w:tcW w:type="dxa" w:w="2493"/>
+            <w:tcW w:type="dxa" w:w="2409"/>
           </w:tcPr>
           <w:p>
+            <w:pPr>
+              <w:spacing w:before="0" w:after="0" w:line="240" w:lineRule="auto"/>
+            </w:pPr>
             <w:r/>
             <w:r>
               <w:rPr>
-                <w:rFonts w:ascii="Times New Roman" w:hAnsi="Times New Roman" w:eastAsia="Times New Roman"/>
+                <w:rFonts w:ascii="Times New Roman" w:hAnsi="Times New Roman" w:cs="Times New Roman" w:eastAsia="Times New Roman"/>
                 <w:b w:val="0"/>
                 <w:i w:val="0"/>
-                <w:sz w:val="20"/>
+                <w:sz w:val="28"/>
               </w:rPr>
               <w:t>☐</w:t>
             </w:r>
@@ -1183,10 +1571,10 @@
       </w:pPr>
       <w:r>
         <w:rPr>
-          <w:rFonts w:ascii="Times New Roman" w:hAnsi="Times New Roman" w:eastAsia="Times New Roman"/>
+          <w:rFonts w:ascii="Times New Roman" w:hAnsi="Times New Roman" w:cs="Times New Roman" w:eastAsia="Times New Roman"/>
           <w:b w:val="0"/>
           <w:i w:val="0"/>
-          <w:sz w:val="22"/>
+          <w:sz w:val="28"/>
         </w:rPr>
         <w:t>За провеждането на събитието е необходимо:</w:t>
       </w:r>
@@ -1197,12 +1585,111 @@
       </w:pPr>
       <w:r>
         <w:rPr>
-          <w:rFonts w:ascii="Times New Roman" w:hAnsi="Times New Roman" w:eastAsia="Times New Roman"/>
+          <w:rFonts w:ascii="Times New Roman" w:hAnsi="Times New Roman" w:cs="Times New Roman" w:eastAsia="Times New Roman"/>
           <w:b w:val="0"/>
           <w:i w:val="0"/>
-          <w:sz w:val="20"/>
+          <w:sz w:val="22"/>
         </w:rPr>
-        <w:t>{{CHK_EQ_BASKET}} Оборудване и спортни съоръжения - Баскетбол;   {{CHK_EQ_VOLLEY}} Оборудване и спортни съоръжения – Волейбол;   {{CHK_EQ_TENNIS}} Оборудване и спортни съоръжения – Тенис;    {{CHK_EQ_VINYL}} Монтиране на предпазна винилова настилка;   {{CHK_EQ_SOUND}} Озвучителна система (оповестителна);   {{CHK_EQ_SCREEN}} Лед екран, табла за резултати;</w:t>
+        <w:t>{{CHK_EQ_BASKET}}</w:t>
+      </w:r>
+      <w:r>
+        <w:rPr>
+          <w:rFonts w:ascii="Times New Roman" w:hAnsi="Times New Roman" w:cs="Times New Roman" w:eastAsia="Times New Roman"/>
+          <w:b w:val="0"/>
+          <w:i w:val="0"/>
+          <w:sz w:val="22"/>
+        </w:rPr>
+        <w:t xml:space="preserve"> Оборудване и спортни съоръжения - Баскетбол;   </w:t>
+      </w:r>
+      <w:r>
+        <w:rPr>
+          <w:rFonts w:ascii="Times New Roman" w:hAnsi="Times New Roman" w:cs="Times New Roman" w:eastAsia="Times New Roman"/>
+          <w:b w:val="0"/>
+          <w:i w:val="0"/>
+          <w:sz w:val="22"/>
+        </w:rPr>
+        <w:t>{{CHK_EQ_VOLLEY}}</w:t>
+      </w:r>
+      <w:r>
+        <w:rPr>
+          <w:rFonts w:ascii="Times New Roman" w:hAnsi="Times New Roman" w:cs="Times New Roman" w:eastAsia="Times New Roman"/>
+          <w:b w:val="0"/>
+          <w:i w:val="0"/>
+          <w:sz w:val="22"/>
+        </w:rPr>
+        <w:t xml:space="preserve"> Оборудване и спортни съоръжения – Волейбол;   </w:t>
+      </w:r>
+      <w:r>
+        <w:rPr>
+          <w:rFonts w:ascii="Times New Roman" w:hAnsi="Times New Roman" w:cs="Times New Roman" w:eastAsia="Times New Roman"/>
+          <w:b w:val="0"/>
+          <w:i w:val="0"/>
+          <w:sz w:val="22"/>
+        </w:rPr>
+        <w:t>{{CHK_EQ_TENNIS}}</w:t>
+      </w:r>
+      <w:r>
+        <w:rPr>
+          <w:rFonts w:ascii="Times New Roman" w:hAnsi="Times New Roman" w:cs="Times New Roman" w:eastAsia="Times New Roman"/>
+          <w:b w:val="0"/>
+          <w:i w:val="0"/>
+          <w:sz w:val="22"/>
+        </w:rPr>
+        <w:t xml:space="preserve"> Оборудване и спортни съоръжения – Тенис;    </w:t>
+      </w:r>
+      <w:r>
+        <w:rPr>
+          <w:rFonts w:ascii="Times New Roman" w:hAnsi="Times New Roman" w:cs="Times New Roman" w:eastAsia="Times New Roman"/>
+          <w:b w:val="0"/>
+          <w:i w:val="0"/>
+          <w:sz w:val="22"/>
+        </w:rPr>
+        <w:t>{{CHK_EQ_VINYL}}</w:t>
+      </w:r>
+      <w:r>
+        <w:rPr>
+          <w:rFonts w:ascii="Times New Roman" w:hAnsi="Times New Roman" w:cs="Times New Roman" w:eastAsia="Times New Roman"/>
+          <w:b w:val="0"/>
+          <w:i w:val="0"/>
+          <w:sz w:val="22"/>
+        </w:rPr>
+        <w:t xml:space="preserve"> Монтиране на предпазна винилова настилка;   </w:t>
+      </w:r>
+      <w:r>
+        <w:rPr>
+          <w:rFonts w:ascii="Times New Roman" w:hAnsi="Times New Roman" w:cs="Times New Roman" w:eastAsia="Times New Roman"/>
+          <w:b w:val="0"/>
+          <w:i w:val="0"/>
+          <w:sz w:val="22"/>
+        </w:rPr>
+        <w:t>{{CHK_EQ_SOUND}}</w:t>
+      </w:r>
+      <w:r>
+        <w:rPr>
+          <w:rFonts w:ascii="Times New Roman" w:hAnsi="Times New Roman" w:cs="Times New Roman" w:eastAsia="Times New Roman"/>
+          <w:b w:val="0"/>
+          <w:i w:val="0"/>
+          <w:sz w:val="22"/>
+        </w:rPr>
+        <w:t xml:space="preserve"> Озвучителна система (оповестителна);   </w:t>
+      </w:r>
+      <w:r>
+        <w:rPr>
+          <w:rFonts w:ascii="Times New Roman" w:hAnsi="Times New Roman" w:cs="Times New Roman" w:eastAsia="Times New Roman"/>
+          <w:b w:val="0"/>
+          <w:i w:val="0"/>
+          <w:sz w:val="22"/>
+        </w:rPr>
+        <w:t>{{CHK_EQ_SCREEN}}</w:t>
+      </w:r>
+      <w:r>
+        <w:rPr>
+          <w:rFonts w:ascii="Times New Roman" w:hAnsi="Times New Roman" w:cs="Times New Roman" w:eastAsia="Times New Roman"/>
+          <w:b w:val="0"/>
+          <w:i w:val="0"/>
+          <w:sz w:val="22"/>
+        </w:rPr>
+        <w:t xml:space="preserve"> Лед екран, табла за резултати;</w:t>
       </w:r>
     </w:p>
     <w:p>
@@ -1211,12 +1698,48 @@
       </w:pPr>
       <w:r>
         <w:rPr>
-          <w:rFonts w:ascii="Times New Roman" w:hAnsi="Times New Roman" w:eastAsia="Times New Roman"/>
+          <w:rFonts w:ascii="Times New Roman" w:hAnsi="Times New Roman" w:cs="Times New Roman" w:eastAsia="Times New Roman"/>
           <w:b w:val="0"/>
           <w:i w:val="0"/>
-          <w:sz w:val="22"/>
+          <w:sz w:val="28"/>
         </w:rPr>
-        <w:t>Изисква се преустройство на залата:  {{CHK_REBUILD_YES}} ДА;  {{CHK_REBUILD_NO}} НЕ</w:t>
+        <w:t xml:space="preserve">Изисква се преустройство на залата:  </w:t>
+      </w:r>
+      <w:r>
+        <w:rPr>
+          <w:rFonts w:ascii="Times New Roman" w:hAnsi="Times New Roman" w:cs="Times New Roman" w:eastAsia="Times New Roman"/>
+          <w:b w:val="0"/>
+          <w:i w:val="0"/>
+          <w:sz w:val="28"/>
+        </w:rPr>
+        <w:t>{{CHK_REBUILD_YES}}</w:t>
+      </w:r>
+      <w:r>
+        <w:rPr>
+          <w:rFonts w:ascii="Times New Roman" w:hAnsi="Times New Roman" w:cs="Times New Roman" w:eastAsia="Times New Roman"/>
+          <w:b w:val="0"/>
+          <w:i w:val="0"/>
+          <w:sz w:val="28"/>
+        </w:rPr>
+        <w:t xml:space="preserve"> ДА;  </w:t>
+      </w:r>
+      <w:r>
+        <w:rPr>
+          <w:rFonts w:ascii="Times New Roman" w:hAnsi="Times New Roman" w:cs="Times New Roman" w:eastAsia="Times New Roman"/>
+          <w:b w:val="0"/>
+          <w:i w:val="0"/>
+          <w:sz w:val="28"/>
+        </w:rPr>
+        <w:t>{{CHK_REBUILD_NO}}</w:t>
+      </w:r>
+      <w:r>
+        <w:rPr>
+          <w:rFonts w:ascii="Times New Roman" w:hAnsi="Times New Roman" w:cs="Times New Roman" w:eastAsia="Times New Roman"/>
+          <w:b w:val="0"/>
+          <w:i w:val="0"/>
+          <w:sz w:val="28"/>
+        </w:rPr>
+        <w:t xml:space="preserve"> НЕ</w:t>
       </w:r>
     </w:p>
     <w:p>
@@ -1225,10 +1748,10 @@
       </w:pPr>
       <w:r>
         <w:rPr>
-          <w:rFonts w:ascii="Times New Roman" w:hAnsi="Times New Roman" w:eastAsia="Times New Roman"/>
+          <w:rFonts w:ascii="Times New Roman" w:hAnsi="Times New Roman" w:cs="Times New Roman" w:eastAsia="Times New Roman"/>
           <w:b w:val="0"/>
           <w:i/>
-          <w:sz w:val="18"/>
+          <w:sz w:val="20"/>
         </w:rPr>
         <w:t>(поставяне на предпазна винилова настилка, внасяне, монтаж и демонтаж на сцена, подиуми и сценично оборудване)</w:t>
       </w:r>
@@ -1239,10 +1762,10 @@
       </w:pPr>
       <w:r>
         <w:rPr>
-          <w:rFonts w:ascii="Times New Roman" w:hAnsi="Times New Roman" w:eastAsia="Times New Roman"/>
+          <w:rFonts w:ascii="Times New Roman" w:hAnsi="Times New Roman" w:cs="Times New Roman" w:eastAsia="Times New Roman"/>
           <w:b w:val="0"/>
           <w:i w:val="0"/>
-          <w:sz w:val="22"/>
+          <w:sz w:val="28"/>
         </w:rPr>
         <w:t>Други бележки: ........................................................................</w:t>
       </w:r>
@@ -1253,10 +1776,10 @@
       </w:pPr>
       <w:r>
         <w:rPr>
-          <w:rFonts w:ascii="Times New Roman" w:hAnsi="Times New Roman" w:eastAsia="Times New Roman"/>
+          <w:rFonts w:ascii="Times New Roman" w:hAnsi="Times New Roman" w:cs="Times New Roman" w:eastAsia="Times New Roman"/>
           <w:b w:val="0"/>
           <w:i w:val="0"/>
-          <w:sz w:val="22"/>
+          <w:sz w:val="28"/>
         </w:rPr>
         <w:t>........................................................................................</w:t>
       </w:r>
@@ -1267,10 +1790,10 @@
       </w:pPr>
       <w:r>
         <w:rPr>
-          <w:rFonts w:ascii="Times New Roman" w:hAnsi="Times New Roman" w:eastAsia="Times New Roman"/>
+          <w:rFonts w:ascii="Times New Roman" w:hAnsi="Times New Roman" w:cs="Times New Roman" w:eastAsia="Times New Roman"/>
           <w:b w:val="0"/>
           <w:i w:val="0"/>
-          <w:sz w:val="22"/>
+          <w:sz w:val="28"/>
         </w:rPr>
         <w:t>........................................................................................</w:t>
       </w:r>
@@ -1281,10 +1804,10 @@
       </w:pPr>
       <w:r>
         <w:rPr>
-          <w:rFonts w:ascii="Times New Roman" w:hAnsi="Times New Roman" w:eastAsia="Times New Roman"/>
+          <w:rFonts w:ascii="Times New Roman" w:hAnsi="Times New Roman" w:cs="Times New Roman" w:eastAsia="Times New Roman"/>
           <w:b w:val="0"/>
           <w:i w:val="0"/>
-          <w:sz w:val="20"/>
+          <w:sz w:val="22"/>
         </w:rPr>
         <w:t>Запознат/а съм, че съгласно Наредба № 7 за определянето и администрирането на местните такси и цени на услуги на територията на община Троян, цената на услуга с ДДС е:</w:t>
       </w:r>
@@ -1295,10 +1818,10 @@
       </w:pPr>
       <w:r>
         <w:rPr>
-          <w:rFonts w:ascii="Times New Roman" w:hAnsi="Times New Roman" w:eastAsia="Times New Roman"/>
+          <w:rFonts w:ascii="Times New Roman" w:hAnsi="Times New Roman" w:cs="Times New Roman" w:eastAsia="Times New Roman"/>
           <w:b/>
           <w:i w:val="0"/>
-          <w:sz w:val="22"/>
+          <w:sz w:val="28"/>
         </w:rPr>
         <w:t>За спортна зала:</w:t>
       </w:r>
@@ -1310,22 +1833,25 @@
         <w:tblLook w:firstColumn="1" w:firstRow="1" w:lastColumn="0" w:lastRow="0" w:noHBand="0" w:noVBand="1" w:val="04A0"/>
       </w:tblPr>
       <w:tblGrid>
-        <w:gridCol w:w="4986"/>
-        <w:gridCol w:w="4986"/>
+        <w:gridCol w:w="4819"/>
+        <w:gridCol w:w="4819"/>
       </w:tblGrid>
       <w:tr>
         <w:tc>
           <w:tcPr>
-            <w:tcW w:type="dxa" w:w="4986"/>
+            <w:tcW w:type="dxa" w:w="4819"/>
           </w:tcPr>
           <w:p>
+            <w:pPr>
+              <w:spacing w:before="0" w:after="0" w:line="240" w:lineRule="auto"/>
+            </w:pPr>
             <w:r/>
             <w:r>
               <w:rPr>
-                <w:rFonts w:ascii="Times New Roman" w:hAnsi="Times New Roman" w:eastAsia="Times New Roman"/>
+                <w:rFonts w:ascii="Times New Roman" w:hAnsi="Times New Roman" w:cs="Times New Roman" w:eastAsia="Times New Roman"/>
                 <w:b/>
                 <w:i w:val="0"/>
-                <w:sz w:val="18"/>
+                <w:sz w:val="20"/>
               </w:rPr>
               <w:t>Наименование на услугата</w:t>
             </w:r>
@@ -1333,16 +1859,19 @@
         </w:tc>
         <w:tc>
           <w:tcPr>
-            <w:tcW w:type="dxa" w:w="4986"/>
+            <w:tcW w:type="dxa" w:w="4819"/>
           </w:tcPr>
           <w:p>
+            <w:pPr>
+              <w:spacing w:before="0" w:after="0" w:line="240" w:lineRule="auto"/>
+            </w:pPr>
             <w:r/>
             <w:r>
               <w:rPr>
-                <w:rFonts w:ascii="Times New Roman" w:hAnsi="Times New Roman" w:eastAsia="Times New Roman"/>
+                <w:rFonts w:ascii="Times New Roman" w:hAnsi="Times New Roman" w:cs="Times New Roman" w:eastAsia="Times New Roman"/>
                 <w:b/>
                 <w:i w:val="0"/>
-                <w:sz w:val="18"/>
+                <w:sz w:val="20"/>
               </w:rPr>
               <w:t>цена в евро</w:t>
             </w:r>
@@ -1352,16 +1881,19 @@
       <w:tr>
         <w:tc>
           <w:tcPr>
-            <w:tcW w:type="dxa" w:w="4986"/>
+            <w:tcW w:type="dxa" w:w="4819"/>
           </w:tcPr>
           <w:p>
+            <w:pPr>
+              <w:spacing w:before="0" w:after="0" w:line="240" w:lineRule="auto"/>
+            </w:pPr>
             <w:r/>
             <w:r>
               <w:rPr>
-                <w:rFonts w:ascii="Times New Roman" w:hAnsi="Times New Roman" w:eastAsia="Times New Roman"/>
+                <w:rFonts w:ascii="Times New Roman" w:hAnsi="Times New Roman" w:cs="Times New Roman" w:eastAsia="Times New Roman"/>
                 <w:b w:val="0"/>
                 <w:i w:val="0"/>
-                <w:sz w:val="18"/>
+                <w:sz w:val="20"/>
               </w:rPr>
               <w:t>1.1. Почасово ползване за тренировъчна дейност и провеждане на състезания и турнири от спортни клубове, регистрирани и осъществяващи дейност на територията на община Троян</w:t>
             </w:r>
@@ -1369,16 +1901,19 @@
         </w:tc>
         <w:tc>
           <w:tcPr>
-            <w:tcW w:type="dxa" w:w="4986"/>
+            <w:tcW w:type="dxa" w:w="4819"/>
           </w:tcPr>
           <w:p>
+            <w:pPr>
+              <w:spacing w:before="0" w:after="0" w:line="240" w:lineRule="auto"/>
+            </w:pPr>
             <w:r/>
             <w:r>
               <w:rPr>
-                <w:rFonts w:ascii="Times New Roman" w:hAnsi="Times New Roman" w:eastAsia="Times New Roman"/>
+                <w:rFonts w:ascii="Times New Roman" w:hAnsi="Times New Roman" w:cs="Times New Roman" w:eastAsia="Times New Roman"/>
                 <w:b w:val="0"/>
                 <w:i w:val="0"/>
-                <w:sz w:val="18"/>
+                <w:sz w:val="20"/>
               </w:rPr>
               <w:t>8,00 евро/час</w:t>
             </w:r>
@@ -1388,16 +1923,19 @@
       <w:tr>
         <w:tc>
           <w:tcPr>
-            <w:tcW w:type="dxa" w:w="4986"/>
+            <w:tcW w:type="dxa" w:w="4819"/>
           </w:tcPr>
           <w:p>
+            <w:pPr>
+              <w:spacing w:before="0" w:after="0" w:line="240" w:lineRule="auto"/>
+            </w:pPr>
             <w:r/>
             <w:r>
               <w:rPr>
-                <w:rFonts w:ascii="Times New Roman" w:hAnsi="Times New Roman" w:eastAsia="Times New Roman"/>
+                <w:rFonts w:ascii="Times New Roman" w:hAnsi="Times New Roman" w:cs="Times New Roman" w:eastAsia="Times New Roman"/>
                 <w:b w:val="0"/>
                 <w:i w:val="0"/>
-                <w:sz w:val="18"/>
+                <w:sz w:val="20"/>
               </w:rPr>
               <w:t>1.2. Почасово ползване за тренировъчна дейност на външни спортни клубове и организации</w:t>
             </w:r>
@@ -1405,16 +1943,19 @@
         </w:tc>
         <w:tc>
           <w:tcPr>
-            <w:tcW w:type="dxa" w:w="4986"/>
+            <w:tcW w:type="dxa" w:w="4819"/>
           </w:tcPr>
           <w:p>
+            <w:pPr>
+              <w:spacing w:before="0" w:after="0" w:line="240" w:lineRule="auto"/>
+            </w:pPr>
             <w:r/>
             <w:r>
               <w:rPr>
-                <w:rFonts w:ascii="Times New Roman" w:hAnsi="Times New Roman" w:eastAsia="Times New Roman"/>
+                <w:rFonts w:ascii="Times New Roman" w:hAnsi="Times New Roman" w:cs="Times New Roman" w:eastAsia="Times New Roman"/>
                 <w:b w:val="0"/>
                 <w:i w:val="0"/>
-                <w:sz w:val="18"/>
+                <w:sz w:val="20"/>
               </w:rPr>
               <w:t>25,00 евро/час</w:t>
             </w:r>
@@ -1424,16 +1965,19 @@
       <w:tr>
         <w:tc>
           <w:tcPr>
-            <w:tcW w:type="dxa" w:w="4986"/>
+            <w:tcW w:type="dxa" w:w="4819"/>
           </w:tcPr>
           <w:p>
+            <w:pPr>
+              <w:spacing w:before="0" w:after="0" w:line="240" w:lineRule="auto"/>
+            </w:pPr>
             <w:r/>
             <w:r>
               <w:rPr>
-                <w:rFonts w:ascii="Times New Roman" w:hAnsi="Times New Roman" w:eastAsia="Times New Roman"/>
+                <w:rFonts w:ascii="Times New Roman" w:hAnsi="Times New Roman" w:cs="Times New Roman" w:eastAsia="Times New Roman"/>
                 <w:b w:val="0"/>
                 <w:i w:val="0"/>
-                <w:sz w:val="18"/>
+                <w:sz w:val="20"/>
               </w:rPr>
               <w:t>1.3. Дневно ползване (до 8 часа в диапазона 08:00 ч. – 22:00 ч.)</w:t>
             </w:r>
@@ -1441,16 +1985,19 @@
         </w:tc>
         <w:tc>
           <w:tcPr>
-            <w:tcW w:type="dxa" w:w="4986"/>
+            <w:tcW w:type="dxa" w:w="4819"/>
           </w:tcPr>
           <w:p>
+            <w:pPr>
+              <w:spacing w:before="0" w:after="0" w:line="240" w:lineRule="auto"/>
+            </w:pPr>
             <w:r/>
             <w:r>
               <w:rPr>
-                <w:rFonts w:ascii="Times New Roman" w:hAnsi="Times New Roman" w:eastAsia="Times New Roman"/>
+                <w:rFonts w:ascii="Times New Roman" w:hAnsi="Times New Roman" w:cs="Times New Roman" w:eastAsia="Times New Roman"/>
                 <w:b w:val="0"/>
                 <w:i w:val="0"/>
-                <w:sz w:val="18"/>
+                <w:sz w:val="20"/>
               </w:rPr>
             </w:r>
           </w:p>
@@ -1459,16 +2006,19 @@
       <w:tr>
         <w:tc>
           <w:tcPr>
-            <w:tcW w:type="dxa" w:w="4986"/>
+            <w:tcW w:type="dxa" w:w="4819"/>
           </w:tcPr>
           <w:p>
+            <w:pPr>
+              <w:spacing w:before="0" w:after="0" w:line="240" w:lineRule="auto"/>
+            </w:pPr>
             <w:r/>
             <w:r>
               <w:rPr>
-                <w:rFonts w:ascii="Times New Roman" w:hAnsi="Times New Roman" w:eastAsia="Times New Roman"/>
+                <w:rFonts w:ascii="Times New Roman" w:hAnsi="Times New Roman" w:cs="Times New Roman" w:eastAsia="Times New Roman"/>
                 <w:b w:val="0"/>
                 <w:i w:val="0"/>
-                <w:sz w:val="18"/>
+                <w:sz w:val="20"/>
               </w:rPr>
               <w:t>1.3.1. за турнири и спортни прояви с публика, организирани от външни клубове – 240,00 евро</w:t>
             </w:r>
@@ -1476,16 +2026,19 @@
         </w:tc>
         <w:tc>
           <w:tcPr>
-            <w:tcW w:type="dxa" w:w="4986"/>
+            <w:tcW w:type="dxa" w:w="4819"/>
           </w:tcPr>
           <w:p>
+            <w:pPr>
+              <w:spacing w:before="0" w:after="0" w:line="240" w:lineRule="auto"/>
+            </w:pPr>
             <w:r/>
             <w:r>
               <w:rPr>
-                <w:rFonts w:ascii="Times New Roman" w:hAnsi="Times New Roman" w:eastAsia="Times New Roman"/>
+                <w:rFonts w:ascii="Times New Roman" w:hAnsi="Times New Roman" w:cs="Times New Roman" w:eastAsia="Times New Roman"/>
                 <w:b w:val="0"/>
                 <w:i w:val="0"/>
-                <w:sz w:val="18"/>
+                <w:sz w:val="20"/>
               </w:rPr>
               <w:t>240 евро</w:t>
             </w:r>
@@ -1495,16 +2048,19 @@
       <w:tr>
         <w:tc>
           <w:tcPr>
-            <w:tcW w:type="dxa" w:w="4986"/>
+            <w:tcW w:type="dxa" w:w="4819"/>
           </w:tcPr>
           <w:p>
+            <w:pPr>
+              <w:spacing w:before="0" w:after="0" w:line="240" w:lineRule="auto"/>
+            </w:pPr>
             <w:r/>
             <w:r>
               <w:rPr>
-                <w:rFonts w:ascii="Times New Roman" w:hAnsi="Times New Roman" w:eastAsia="Times New Roman"/>
+                <w:rFonts w:ascii="Times New Roman" w:hAnsi="Times New Roman" w:cs="Times New Roman" w:eastAsia="Times New Roman"/>
                 <w:b w:val="0"/>
                 <w:i w:val="0"/>
-                <w:sz w:val="18"/>
+                <w:sz w:val="20"/>
               </w:rPr>
               <w:t>1.3.2.  за събития с ниско натоварване</w:t>
             </w:r>
@@ -1512,16 +2068,19 @@
         </w:tc>
         <w:tc>
           <w:tcPr>
-            <w:tcW w:type="dxa" w:w="4986"/>
+            <w:tcW w:type="dxa" w:w="4819"/>
           </w:tcPr>
           <w:p>
+            <w:pPr>
+              <w:spacing w:before="0" w:after="0" w:line="240" w:lineRule="auto"/>
+            </w:pPr>
             <w:r/>
             <w:r>
               <w:rPr>
-                <w:rFonts w:ascii="Times New Roman" w:hAnsi="Times New Roman" w:eastAsia="Times New Roman"/>
+                <w:rFonts w:ascii="Times New Roman" w:hAnsi="Times New Roman" w:cs="Times New Roman" w:eastAsia="Times New Roman"/>
                 <w:b w:val="0"/>
                 <w:i w:val="0"/>
-                <w:sz w:val="18"/>
+                <w:sz w:val="20"/>
               </w:rPr>
               <w:t>240 евро</w:t>
             </w:r>
@@ -1531,16 +2090,19 @@
       <w:tr>
         <w:tc>
           <w:tcPr>
-            <w:tcW w:type="dxa" w:w="4986"/>
+            <w:tcW w:type="dxa" w:w="4819"/>
           </w:tcPr>
           <w:p>
+            <w:pPr>
+              <w:spacing w:before="0" w:after="0" w:line="240" w:lineRule="auto"/>
+            </w:pPr>
             <w:r/>
             <w:r>
               <w:rPr>
-                <w:rFonts w:ascii="Times New Roman" w:hAnsi="Times New Roman" w:eastAsia="Times New Roman"/>
+                <w:rFonts w:ascii="Times New Roman" w:hAnsi="Times New Roman" w:cs="Times New Roman" w:eastAsia="Times New Roman"/>
                 <w:b w:val="0"/>
                 <w:i w:val="0"/>
-                <w:sz w:val="18"/>
+                <w:sz w:val="20"/>
               </w:rPr>
               <w:t>1.3.3.  за събития със средно натоварване</w:t>
             </w:r>
@@ -1548,16 +2110,19 @@
         </w:tc>
         <w:tc>
           <w:tcPr>
-            <w:tcW w:type="dxa" w:w="4986"/>
+            <w:tcW w:type="dxa" w:w="4819"/>
           </w:tcPr>
           <w:p>
+            <w:pPr>
+              <w:spacing w:before="0" w:after="0" w:line="240" w:lineRule="auto"/>
+            </w:pPr>
             <w:r/>
             <w:r>
               <w:rPr>
-                <w:rFonts w:ascii="Times New Roman" w:hAnsi="Times New Roman" w:eastAsia="Times New Roman"/>
+                <w:rFonts w:ascii="Times New Roman" w:hAnsi="Times New Roman" w:cs="Times New Roman" w:eastAsia="Times New Roman"/>
                 <w:b w:val="0"/>
                 <w:i w:val="0"/>
-                <w:sz w:val="18"/>
+                <w:sz w:val="20"/>
               </w:rPr>
               <w:t>360 евро</w:t>
             </w:r>
@@ -1567,16 +2132,19 @@
       <w:tr>
         <w:tc>
           <w:tcPr>
-            <w:tcW w:type="dxa" w:w="4986"/>
+            <w:tcW w:type="dxa" w:w="4819"/>
           </w:tcPr>
           <w:p>
+            <w:pPr>
+              <w:spacing w:before="0" w:after="0" w:line="240" w:lineRule="auto"/>
+            </w:pPr>
             <w:r/>
             <w:r>
               <w:rPr>
-                <w:rFonts w:ascii="Times New Roman" w:hAnsi="Times New Roman" w:eastAsia="Times New Roman"/>
+                <w:rFonts w:ascii="Times New Roman" w:hAnsi="Times New Roman" w:cs="Times New Roman" w:eastAsia="Times New Roman"/>
                 <w:b w:val="0"/>
                 <w:i w:val="0"/>
-                <w:sz w:val="18"/>
+                <w:sz w:val="20"/>
               </w:rPr>
               <w:t>1.3.4.  за събития с високо натоварване</w:t>
             </w:r>
@@ -1584,16 +2152,19 @@
         </w:tc>
         <w:tc>
           <w:tcPr>
-            <w:tcW w:type="dxa" w:w="4986"/>
+            <w:tcW w:type="dxa" w:w="4819"/>
           </w:tcPr>
           <w:p>
+            <w:pPr>
+              <w:spacing w:before="0" w:after="0" w:line="240" w:lineRule="auto"/>
+            </w:pPr>
             <w:r/>
             <w:r>
               <w:rPr>
-                <w:rFonts w:ascii="Times New Roman" w:hAnsi="Times New Roman" w:eastAsia="Times New Roman"/>
+                <w:rFonts w:ascii="Times New Roman" w:hAnsi="Times New Roman" w:cs="Times New Roman" w:eastAsia="Times New Roman"/>
                 <w:b w:val="0"/>
                 <w:i w:val="0"/>
-                <w:sz w:val="18"/>
+                <w:sz w:val="20"/>
               </w:rPr>
               <w:t>480 евро</w:t>
             </w:r>
@@ -1612,10 +2183,10 @@
       </w:pPr>
       <w:r>
         <w:rPr>
-          <w:rFonts w:ascii="Times New Roman" w:hAnsi="Times New Roman" w:eastAsia="Times New Roman"/>
+          <w:rFonts w:ascii="Times New Roman" w:hAnsi="Times New Roman" w:cs="Times New Roman" w:eastAsia="Times New Roman"/>
           <w:b/>
           <w:i w:val="0"/>
-          <w:sz w:val="22"/>
+          <w:sz w:val="28"/>
         </w:rPr>
         <w:t>За тренировъчна зала:</w:t>
       </w:r>
@@ -1627,22 +2198,25 @@
         <w:tblLook w:firstColumn="1" w:firstRow="1" w:lastColumn="0" w:lastRow="0" w:noHBand="0" w:noVBand="1" w:val="04A0"/>
       </w:tblPr>
       <w:tblGrid>
-        <w:gridCol w:w="4986"/>
-        <w:gridCol w:w="4986"/>
+        <w:gridCol w:w="4819"/>
+        <w:gridCol w:w="4819"/>
       </w:tblGrid>
       <w:tr>
         <w:tc>
           <w:tcPr>
-            <w:tcW w:type="dxa" w:w="4986"/>
+            <w:tcW w:type="dxa" w:w="4819"/>
           </w:tcPr>
           <w:p>
+            <w:pPr>
+              <w:spacing w:before="0" w:after="0" w:line="240" w:lineRule="auto"/>
+            </w:pPr>
             <w:r/>
             <w:r>
               <w:rPr>
-                <w:rFonts w:ascii="Times New Roman" w:hAnsi="Times New Roman" w:eastAsia="Times New Roman"/>
+                <w:rFonts w:ascii="Times New Roman" w:hAnsi="Times New Roman" w:cs="Times New Roman" w:eastAsia="Times New Roman"/>
                 <w:b/>
                 <w:i w:val="0"/>
-                <w:sz w:val="18"/>
+                <w:sz w:val="20"/>
               </w:rPr>
               <w:t>Наименование на услугата</w:t>
             </w:r>
@@ -1650,16 +2224,19 @@
         </w:tc>
         <w:tc>
           <w:tcPr>
-            <w:tcW w:type="dxa" w:w="4986"/>
+            <w:tcW w:type="dxa" w:w="4819"/>
           </w:tcPr>
           <w:p>
+            <w:pPr>
+              <w:spacing w:before="0" w:after="0" w:line="240" w:lineRule="auto"/>
+            </w:pPr>
             <w:r/>
             <w:r>
               <w:rPr>
-                <w:rFonts w:ascii="Times New Roman" w:hAnsi="Times New Roman" w:eastAsia="Times New Roman"/>
+                <w:rFonts w:ascii="Times New Roman" w:hAnsi="Times New Roman" w:cs="Times New Roman" w:eastAsia="Times New Roman"/>
                 <w:b/>
                 <w:i w:val="0"/>
-                <w:sz w:val="18"/>
+                <w:sz w:val="20"/>
               </w:rPr>
               <w:t>цена в евро</w:t>
             </w:r>
@@ -1669,16 +2246,19 @@
       <w:tr>
         <w:tc>
           <w:tcPr>
-            <w:tcW w:type="dxa" w:w="4986"/>
+            <w:tcW w:type="dxa" w:w="4819"/>
           </w:tcPr>
           <w:p>
+            <w:pPr>
+              <w:spacing w:before="0" w:after="0" w:line="240" w:lineRule="auto"/>
+            </w:pPr>
             <w:r/>
             <w:r>
               <w:rPr>
-                <w:rFonts w:ascii="Times New Roman" w:hAnsi="Times New Roman" w:eastAsia="Times New Roman"/>
+                <w:rFonts w:ascii="Times New Roman" w:hAnsi="Times New Roman" w:cs="Times New Roman" w:eastAsia="Times New Roman"/>
                 <w:b w:val="0"/>
                 <w:i w:val="0"/>
-                <w:sz w:val="18"/>
+                <w:sz w:val="20"/>
               </w:rPr>
               <w:t>2.1. Почасово ползване за тренировъчна дейност и провеждане на състезания и турнири от спортни клубове, регистрирани и осъществяващи дейност на територията на община Троян</w:t>
             </w:r>
@@ -1686,16 +2266,19 @@
         </w:tc>
         <w:tc>
           <w:tcPr>
-            <w:tcW w:type="dxa" w:w="4986"/>
+            <w:tcW w:type="dxa" w:w="4819"/>
           </w:tcPr>
           <w:p>
+            <w:pPr>
+              <w:spacing w:before="0" w:after="0" w:line="240" w:lineRule="auto"/>
+            </w:pPr>
             <w:r/>
             <w:r>
               <w:rPr>
-                <w:rFonts w:ascii="Times New Roman" w:hAnsi="Times New Roman" w:eastAsia="Times New Roman"/>
+                <w:rFonts w:ascii="Times New Roman" w:hAnsi="Times New Roman" w:cs="Times New Roman" w:eastAsia="Times New Roman"/>
                 <w:b w:val="0"/>
                 <w:i w:val="0"/>
-                <w:sz w:val="18"/>
+                <w:sz w:val="20"/>
               </w:rPr>
               <w:t>5,00 евро/час</w:t>
             </w:r>
@@ -1705,16 +2288,19 @@
       <w:tr>
         <w:tc>
           <w:tcPr>
-            <w:tcW w:type="dxa" w:w="4986"/>
+            <w:tcW w:type="dxa" w:w="4819"/>
           </w:tcPr>
           <w:p>
+            <w:pPr>
+              <w:spacing w:before="0" w:after="0" w:line="240" w:lineRule="auto"/>
+            </w:pPr>
             <w:r/>
             <w:r>
               <w:rPr>
-                <w:rFonts w:ascii="Times New Roman" w:hAnsi="Times New Roman" w:eastAsia="Times New Roman"/>
+                <w:rFonts w:ascii="Times New Roman" w:hAnsi="Times New Roman" w:cs="Times New Roman" w:eastAsia="Times New Roman"/>
                 <w:b w:val="0"/>
                 <w:i w:val="0"/>
-                <w:sz w:val="18"/>
+                <w:sz w:val="20"/>
               </w:rPr>
               <w:t>2.2. Почасово ползване за тренировъчна дейност и провеждане на състезания и турнири на външни спортни клубове и организации</w:t>
             </w:r>
@@ -1722,16 +2308,19 @@
         </w:tc>
         <w:tc>
           <w:tcPr>
-            <w:tcW w:type="dxa" w:w="4986"/>
+            <w:tcW w:type="dxa" w:w="4819"/>
           </w:tcPr>
           <w:p>
+            <w:pPr>
+              <w:spacing w:before="0" w:after="0" w:line="240" w:lineRule="auto"/>
+            </w:pPr>
             <w:r/>
             <w:r>
               <w:rPr>
-                <w:rFonts w:ascii="Times New Roman" w:hAnsi="Times New Roman" w:eastAsia="Times New Roman"/>
+                <w:rFonts w:ascii="Times New Roman" w:hAnsi="Times New Roman" w:cs="Times New Roman" w:eastAsia="Times New Roman"/>
                 <w:b w:val="0"/>
                 <w:i w:val="0"/>
-                <w:sz w:val="18"/>
+                <w:sz w:val="20"/>
               </w:rPr>
               <w:t>15,00 евро/час</w:t>
             </w:r>
@@ -1750,10 +2339,10 @@
       </w:pPr>
       <w:r>
         <w:rPr>
-          <w:rFonts w:ascii="Times New Roman" w:hAnsi="Times New Roman" w:eastAsia="Times New Roman"/>
+          <w:rFonts w:ascii="Times New Roman" w:hAnsi="Times New Roman" w:cs="Times New Roman" w:eastAsia="Times New Roman"/>
           <w:b/>
           <w:i w:val="0"/>
-          <w:sz w:val="22"/>
+          <w:sz w:val="28"/>
         </w:rPr>
         <w:t>За конферентна зала:</w:t>
       </w:r>
@@ -1765,22 +2354,25 @@
         <w:tblLook w:firstColumn="1" w:firstRow="1" w:lastColumn="0" w:lastRow="0" w:noHBand="0" w:noVBand="1" w:val="04A0"/>
       </w:tblPr>
       <w:tblGrid>
-        <w:gridCol w:w="4986"/>
-        <w:gridCol w:w="4986"/>
+        <w:gridCol w:w="4819"/>
+        <w:gridCol w:w="4819"/>
       </w:tblGrid>
       <w:tr>
         <w:tc>
           <w:tcPr>
-            <w:tcW w:type="dxa" w:w="4986"/>
+            <w:tcW w:type="dxa" w:w="4819"/>
           </w:tcPr>
           <w:p>
+            <w:pPr>
+              <w:spacing w:before="0" w:after="0" w:line="240" w:lineRule="auto"/>
+            </w:pPr>
             <w:r/>
             <w:r>
               <w:rPr>
-                <w:rFonts w:ascii="Times New Roman" w:hAnsi="Times New Roman" w:eastAsia="Times New Roman"/>
+                <w:rFonts w:ascii="Times New Roman" w:hAnsi="Times New Roman" w:cs="Times New Roman" w:eastAsia="Times New Roman"/>
                 <w:b/>
                 <w:i w:val="0"/>
-                <w:sz w:val="18"/>
+                <w:sz w:val="20"/>
               </w:rPr>
               <w:t>Наименование на услугата</w:t>
             </w:r>
@@ -1788,16 +2380,19 @@
         </w:tc>
         <w:tc>
           <w:tcPr>
-            <w:tcW w:type="dxa" w:w="4986"/>
+            <w:tcW w:type="dxa" w:w="4819"/>
           </w:tcPr>
           <w:p>
+            <w:pPr>
+              <w:spacing w:before="0" w:after="0" w:line="240" w:lineRule="auto"/>
+            </w:pPr>
             <w:r/>
             <w:r>
               <w:rPr>
-                <w:rFonts w:ascii="Times New Roman" w:hAnsi="Times New Roman" w:eastAsia="Times New Roman"/>
+                <w:rFonts w:ascii="Times New Roman" w:hAnsi="Times New Roman" w:cs="Times New Roman" w:eastAsia="Times New Roman"/>
                 <w:b/>
                 <w:i w:val="0"/>
-                <w:sz w:val="18"/>
+                <w:sz w:val="20"/>
               </w:rPr>
               <w:t>цена в евро</w:t>
             </w:r>
@@ -1807,16 +2402,19 @@
       <w:tr>
         <w:tc>
           <w:tcPr>
-            <w:tcW w:type="dxa" w:w="4986"/>
+            <w:tcW w:type="dxa" w:w="4819"/>
           </w:tcPr>
           <w:p>
+            <w:pPr>
+              <w:spacing w:before="0" w:after="0" w:line="240" w:lineRule="auto"/>
+            </w:pPr>
             <w:r/>
             <w:r>
               <w:rPr>
-                <w:rFonts w:ascii="Times New Roman" w:hAnsi="Times New Roman" w:eastAsia="Times New Roman"/>
+                <w:rFonts w:ascii="Times New Roman" w:hAnsi="Times New Roman" w:cs="Times New Roman" w:eastAsia="Times New Roman"/>
                 <w:b w:val="0"/>
                 <w:i w:val="0"/>
-                <w:sz w:val="18"/>
+                <w:sz w:val="20"/>
               </w:rPr>
               <w:t>3.1. Почасово ползване на конферентна зала в Многофункционална спортна зала „Троян“</w:t>
             </w:r>
@@ -1824,16 +2422,19 @@
         </w:tc>
         <w:tc>
           <w:tcPr>
-            <w:tcW w:type="dxa" w:w="4986"/>
+            <w:tcW w:type="dxa" w:w="4819"/>
           </w:tcPr>
           <w:p>
+            <w:pPr>
+              <w:spacing w:before="0" w:after="0" w:line="240" w:lineRule="auto"/>
+            </w:pPr>
             <w:r/>
             <w:r>
               <w:rPr>
-                <w:rFonts w:ascii="Times New Roman" w:hAnsi="Times New Roman" w:eastAsia="Times New Roman"/>
+                <w:rFonts w:ascii="Times New Roman" w:hAnsi="Times New Roman" w:cs="Times New Roman" w:eastAsia="Times New Roman"/>
                 <w:b w:val="0"/>
                 <w:i w:val="0"/>
-                <w:sz w:val="18"/>
+                <w:sz w:val="20"/>
               </w:rPr>
               <w:t>15,00 евро/час</w:t>
             </w:r>
@@ -1852,10 +2453,10 @@
       </w:pPr>
       <w:r>
         <w:rPr>
-          <w:rFonts w:ascii="Times New Roman" w:hAnsi="Times New Roman" w:eastAsia="Times New Roman"/>
+          <w:rFonts w:ascii="Times New Roman" w:hAnsi="Times New Roman" w:cs="Times New Roman" w:eastAsia="Times New Roman"/>
           <w:b w:val="0"/>
           <w:i w:val="0"/>
-          <w:sz w:val="20"/>
+          <w:sz w:val="22"/>
         </w:rPr>
         <w:t>Дължимата сума се заплаща до 3 работни дни след получаване на Разрешение за ползване на:</w:t>
       </w:r>
@@ -1866,10 +2467,10 @@
       </w:pPr>
       <w:r>
         <w:rPr>
-          <w:rFonts w:ascii="Times New Roman" w:hAnsi="Times New Roman" w:eastAsia="Times New Roman"/>
+          <w:rFonts w:ascii="Times New Roman" w:hAnsi="Times New Roman" w:cs="Times New Roman" w:eastAsia="Times New Roman"/>
           <w:b w:val="0"/>
           <w:i w:val="0"/>
-          <w:sz w:val="20"/>
+          <w:sz w:val="22"/>
         </w:rPr>
         <w:t>1. Касата на Община Троян – административна сграда на адрес Троян, пл. „Възраждане“ № 1</w:t>
       </w:r>
@@ -1880,10 +2481,10 @@
       </w:pPr>
       <w:r>
         <w:rPr>
-          <w:rFonts w:ascii="Times New Roman" w:hAnsi="Times New Roman" w:eastAsia="Times New Roman"/>
+          <w:rFonts w:ascii="Times New Roman" w:hAnsi="Times New Roman" w:cs="Times New Roman" w:eastAsia="Times New Roman"/>
           <w:b w:val="0"/>
           <w:i w:val="0"/>
-          <w:sz w:val="20"/>
+          <w:sz w:val="22"/>
         </w:rPr>
         <w:t>2. С ПОС терминал в отдел „Услуги на гражданите“</w:t>
       </w:r>
@@ -1894,10 +2495,10 @@
       </w:pPr>
       <w:r>
         <w:rPr>
-          <w:rFonts w:ascii="Times New Roman" w:hAnsi="Times New Roman" w:eastAsia="Times New Roman"/>
+          <w:rFonts w:ascii="Times New Roman" w:hAnsi="Times New Roman" w:cs="Times New Roman" w:eastAsia="Times New Roman"/>
           <w:b w:val="0"/>
           <w:i w:val="0"/>
-          <w:sz w:val="20"/>
+          <w:sz w:val="22"/>
         </w:rPr>
         <w:t>3. По банков път на сметка:</w:t>
       </w:r>
@@ -1908,10 +2509,10 @@
       </w:pPr>
       <w:r>
         <w:rPr>
-          <w:rFonts w:ascii="Times New Roman" w:hAnsi="Times New Roman" w:eastAsia="Times New Roman"/>
+          <w:rFonts w:ascii="Times New Roman" w:hAnsi="Times New Roman" w:cs="Times New Roman" w:eastAsia="Times New Roman"/>
           <w:b w:val="0"/>
           <w:i w:val="0"/>
-          <w:sz w:val="20"/>
+          <w:sz w:val="22"/>
         </w:rPr>
         <w:t>IBAN: BG92UBBS81558420008108</w:t>
       </w:r>
@@ -1922,10 +2523,10 @@
       </w:pPr>
       <w:r>
         <w:rPr>
-          <w:rFonts w:ascii="Times New Roman" w:hAnsi="Times New Roman" w:eastAsia="Times New Roman"/>
+          <w:rFonts w:ascii="Times New Roman" w:hAnsi="Times New Roman" w:cs="Times New Roman" w:eastAsia="Times New Roman"/>
           <w:b w:val="0"/>
           <w:i w:val="0"/>
-          <w:sz w:val="20"/>
+          <w:sz w:val="22"/>
         </w:rPr>
         <w:t>BIC: UBBSBGSF</w:t>
       </w:r>
@@ -1936,24 +2537,24 @@
       </w:pPr>
       <w:r>
         <w:rPr>
-          <w:rFonts w:ascii="Times New Roman" w:hAnsi="Times New Roman" w:eastAsia="Times New Roman"/>
+          <w:rFonts w:ascii="Times New Roman" w:hAnsi="Times New Roman" w:cs="Times New Roman" w:eastAsia="Times New Roman"/>
           <w:b w:val="0"/>
           <w:i w:val="0"/>
-          <w:sz w:val="20"/>
+          <w:sz w:val="22"/>
         </w:rPr>
         <w:t>Банка: „Обединена Българска Банка“ АД</w:t>
       </w:r>
     </w:p>
     <w:p>
       <w:pPr>
-        <w:spacing w:before="0" w:after="200" w:line="240" w:lineRule="auto"/>
+        <w:spacing w:before="0" w:after="240" w:line="240" w:lineRule="auto"/>
       </w:pPr>
       <w:r>
         <w:rPr>
-          <w:rFonts w:ascii="Times New Roman" w:hAnsi="Times New Roman" w:eastAsia="Times New Roman"/>
+          <w:rFonts w:ascii="Times New Roman" w:hAnsi="Times New Roman" w:cs="Times New Roman" w:eastAsia="Times New Roman"/>
           <w:b w:val="0"/>
           <w:i/>
-          <w:sz w:val="18"/>
+          <w:sz w:val="20"/>
         </w:rPr>
         <w:t>* Забележка: При невнасяне на дължимите такси в регламентирания срок, заявлението се счита оттеглено.</w:t>
       </w:r>
@@ -1961,34 +2562,52 @@
     <w:p>
       <w:pPr>
         <w:tabs>
-          <w:tab w:pos="9000" w:val="right"/>
+          <w:tab w:pos="9071" w:val="right"/>
         </w:tabs>
-        <w:spacing w:after="0"/>
+        <w:spacing w:before="0" w:after="0" w:line="240" w:lineRule="auto"/>
       </w:pPr>
       <w:r>
         <w:rPr>
-          <w:rFonts w:ascii="Times New Roman" w:hAnsi="Times New Roman" w:eastAsia="Times New Roman"/>
+          <w:rFonts w:ascii="Times New Roman" w:hAnsi="Times New Roman" w:cs="Times New Roman" w:eastAsia="Times New Roman"/>
           <w:b w:val="0"/>
           <w:i w:val="0"/>
-          <w:sz w:val="22"/>
+          <w:sz w:val="28"/>
         </w:rPr>
-        <w:t>Дата: {{TODAY}} г.</w:t>
+        <w:t xml:space="preserve">Дата: </w:t>
       </w:r>
       <w:r>
         <w:rPr>
-          <w:rFonts w:ascii="Times New Roman" w:hAnsi="Times New Roman" w:eastAsia="Times New Roman"/>
+          <w:rFonts w:ascii="Times New Roman" w:hAnsi="Times New Roman" w:cs="Times New Roman" w:eastAsia="Times New Roman"/>
           <w:b w:val="0"/>
           <w:i w:val="0"/>
-          <w:sz w:val="22"/>
+          <w:sz w:val="28"/>
+        </w:rPr>
+        <w:t>{{TODAY}}</w:t>
+      </w:r>
+      <w:r>
+        <w:rPr>
+          <w:rFonts w:ascii="Times New Roman" w:hAnsi="Times New Roman" w:cs="Times New Roman" w:eastAsia="Times New Roman"/>
+          <w:b w:val="0"/>
+          <w:i w:val="0"/>
+          <w:sz w:val="28"/>
+        </w:rPr>
+        <w:t xml:space="preserve"> г.</w:t>
+      </w:r>
+      <w:r>
+        <w:rPr>
+          <w:rFonts w:ascii="Times New Roman" w:hAnsi="Times New Roman" w:cs="Times New Roman" w:eastAsia="Times New Roman"/>
+          <w:b w:val="0"/>
+          <w:i w:val="0"/>
+          <w:sz w:val="28"/>
         </w:rPr>
         <w:tab/>
       </w:r>
       <w:r>
         <w:rPr>
-          <w:rFonts w:ascii="Times New Roman" w:hAnsi="Times New Roman" w:eastAsia="Times New Roman"/>
+          <w:rFonts w:ascii="Times New Roman" w:hAnsi="Times New Roman" w:cs="Times New Roman" w:eastAsia="Times New Roman"/>
           <w:b w:val="0"/>
           <w:i w:val="0"/>
-          <w:sz w:val="22"/>
+          <w:sz w:val="28"/>
         </w:rPr>
         <w:t>С уважение: ..............................................</w:t>
       </w:r>
@@ -1996,31 +2615,31 @@
     <w:p>
       <w:pPr>
         <w:tabs>
-          <w:tab w:pos="9000" w:val="right"/>
+          <w:tab w:pos="9071" w:val="right"/>
         </w:tabs>
-        <w:spacing w:before="0"/>
+        <w:spacing w:before="0" w:after="0" w:line="240" w:lineRule="auto"/>
       </w:pPr>
       <w:r>
         <w:rPr>
-          <w:rFonts w:ascii="Times New Roman" w:hAnsi="Times New Roman" w:eastAsia="Times New Roman"/>
+          <w:rFonts w:ascii="Times New Roman" w:hAnsi="Times New Roman" w:cs="Times New Roman" w:eastAsia="Times New Roman"/>
           <w:b w:val="0"/>
           <w:i w:val="0"/>
-          <w:sz w:val="22"/>
+          <w:sz w:val="28"/>
         </w:rPr>
         <w:t>Град Троян</w:t>
       </w:r>
       <w:r>
         <w:rPr>
-          <w:rFonts w:ascii="Times New Roman" w:hAnsi="Times New Roman" w:eastAsia="Times New Roman"/>
+          <w:rFonts w:ascii="Times New Roman" w:hAnsi="Times New Roman" w:cs="Times New Roman" w:eastAsia="Times New Roman"/>
           <w:b w:val="0"/>
           <w:i w:val="0"/>
-          <w:sz w:val="22"/>
+          <w:sz w:val="28"/>
         </w:rPr>
         <w:tab/>
       </w:r>
       <w:r>
         <w:rPr>
-          <w:rFonts w:ascii="Times New Roman" w:hAnsi="Times New Roman" w:eastAsia="Times New Roman"/>
+          <w:rFonts w:ascii="Times New Roman" w:hAnsi="Times New Roman" w:cs="Times New Roman" w:eastAsia="Times New Roman"/>
           <w:b w:val="0"/>
           <w:i w:val="0"/>
           <w:sz w:val="20"/>
@@ -2029,7 +2648,7 @@
       </w:r>
     </w:p>
     <w:sectPr>
-      <w:pgSz w:w="12240" w:h="15840"/>
+      <w:pgSz w:w="11906" w:h="16838"/>
       <w:pgMar w:top="850" w:right="1134" w:bottom="850" w:left="1134" w:header="720" w:footer="720" w:gutter="0"/>
       <w:cols w:space="720"/>
       <w:docGrid w:linePitch="360"/>
@@ -2401,6 +3020,10 @@
     <w:name w:val="Normal"/>
     <w:qFormat/>
     <w:rsid w:val="00FC693F"/>
+    <w:rPr>
+      <w:rFonts w:ascii="Times New Roman" w:hAnsi="Times New Roman" w:cs="Times New Roman" w:eastAsia="Times New Roman"/>
+      <w:sz w:val="28"/>
+    </w:rPr>
   </w:style>
   <w:style w:type="paragraph" w:styleId="Header">
     <w:name w:val="header"/>

</xml_diff>

<commit_message>
Align Appendix 12 DOCX with blank: bold checkboxes, equipment lines, bank details.
Match the official form screenshots for hall/equipment emphasis, numbered price sections, and bold IBAN/BIC/bank rows.

Co-authored-by: Anatoli Penev <toli18@users.noreply.github.com>
</commit_message>
<xml_diff>
--- a/backend/app/static/troyan-hall/prilozhenie-12.docx
+++ b/backend/app/static/troyan-hall/prilozhenie-12.docx
@@ -100,7 +100,7 @@
                       <w:rFonts w:ascii="Times New Roman" w:hAnsi="Times New Roman" w:cs="Times New Roman" w:eastAsia="Times New Roman"/>
                       <w:b/>
                       <w:i w:val="0"/>
-                      <w:sz w:val="28"/>
+                      <w:sz w:val="24"/>
                     </w:rPr>
                     <w:t>ОБЩИНА ТРОЯН</w:t>
                   </w:r>
@@ -114,7 +114,7 @@
                       <w:rFonts w:ascii="Times New Roman" w:hAnsi="Times New Roman" w:cs="Times New Roman" w:eastAsia="Times New Roman"/>
                       <w:b w:val="0"/>
                       <w:i w:val="0"/>
-                      <w:sz w:val="22"/>
+                      <w:sz w:val="20"/>
                     </w:rPr>
                     <w:t>№ .............................................</w:t>
                   </w:r>
@@ -138,7 +138,7 @@
                 <w:rFonts w:ascii="Times New Roman" w:hAnsi="Times New Roman" w:cs="Times New Roman" w:eastAsia="Times New Roman"/>
                 <w:b/>
                 <w:i w:val="0"/>
-                <w:sz w:val="28"/>
+                <w:sz w:val="24"/>
               </w:rPr>
               <w:t>Приложение № 12</w:t>
             </w:r>
@@ -153,7 +153,7 @@
                 <w:rFonts w:ascii="Times New Roman" w:hAnsi="Times New Roman" w:cs="Times New Roman" w:eastAsia="Times New Roman"/>
                 <w:b w:val="0"/>
                 <w:i/>
-                <w:sz w:val="20"/>
+                <w:sz w:val="18"/>
               </w:rPr>
               <w:t>(ново, Решение № 965/17.09.2026 г.)</w:t>
             </w:r>
@@ -168,7 +168,7 @@
                 <w:rFonts w:ascii="Times New Roman" w:hAnsi="Times New Roman" w:cs="Times New Roman" w:eastAsia="Times New Roman"/>
                 <w:b w:val="0"/>
                 <w:i w:val="0"/>
-                <w:sz w:val="22"/>
+                <w:sz w:val="20"/>
               </w:rPr>
               <w:t>Вх. № .............................................</w:t>
             </w:r>
@@ -183,7 +183,7 @@
                 <w:rFonts w:ascii="Times New Roman" w:hAnsi="Times New Roman" w:cs="Times New Roman" w:eastAsia="Times New Roman"/>
                 <w:b w:val="0"/>
                 <w:i w:val="0"/>
-                <w:sz w:val="22"/>
+                <w:sz w:val="20"/>
               </w:rPr>
               <w:t>Дата ...............................................</w:t>
             </w:r>
@@ -221,7 +221,7 @@
           <w:rFonts w:ascii="Times New Roman" w:hAnsi="Times New Roman" w:cs="Times New Roman" w:eastAsia="Times New Roman"/>
           <w:b/>
           <w:i w:val="0"/>
-          <w:sz w:val="28"/>
+          <w:sz w:val="24"/>
         </w:rPr>
         <w:t>ползване на спортни зали и помещения в</w:t>
       </w:r>
@@ -236,7 +236,7 @@
           <w:rFonts w:ascii="Times New Roman" w:hAnsi="Times New Roman" w:cs="Times New Roman" w:eastAsia="Times New Roman"/>
           <w:b/>
           <w:i w:val="0"/>
-          <w:sz w:val="28"/>
+          <w:sz w:val="24"/>
         </w:rPr>
         <w:t>Многофункционална спортна зала „Троян“</w:t>
       </w:r>
@@ -250,7 +250,7 @@
           <w:rFonts w:ascii="Times New Roman" w:hAnsi="Times New Roman" w:cs="Times New Roman" w:eastAsia="Times New Roman"/>
           <w:b w:val="0"/>
           <w:i w:val="0"/>
-          <w:sz w:val="28"/>
+          <w:sz w:val="24"/>
         </w:rPr>
         <w:t xml:space="preserve">от </w:t>
       </w:r>
@@ -259,7 +259,7 @@
           <w:rFonts w:ascii="Times New Roman" w:hAnsi="Times New Roman" w:cs="Times New Roman" w:eastAsia="Times New Roman"/>
           <w:b w:val="0"/>
           <w:i w:val="0"/>
-          <w:sz w:val="28"/>
+          <w:sz w:val="24"/>
         </w:rPr>
         <w:t>{{ORG_NAME}}</w:t>
       </w:r>
@@ -274,7 +274,7 @@
           <w:rFonts w:ascii="Times New Roman" w:hAnsi="Times New Roman" w:cs="Times New Roman" w:eastAsia="Times New Roman"/>
           <w:b w:val="0"/>
           <w:i/>
-          <w:sz w:val="20"/>
+          <w:sz w:val="18"/>
         </w:rPr>
         <w:t>(посочете трите имена за физическото лице или наименованието на юридическото лице)</w:t>
       </w:r>
@@ -288,7 +288,7 @@
           <w:rFonts w:ascii="Times New Roman" w:hAnsi="Times New Roman" w:cs="Times New Roman" w:eastAsia="Times New Roman"/>
           <w:b w:val="0"/>
           <w:i w:val="0"/>
-          <w:sz w:val="28"/>
+          <w:sz w:val="24"/>
         </w:rPr>
         <w:t xml:space="preserve">ЕГН/ЕИК </w:t>
       </w:r>
@@ -297,7 +297,7 @@
           <w:rFonts w:ascii="Times New Roman" w:hAnsi="Times New Roman" w:cs="Times New Roman" w:eastAsia="Times New Roman"/>
           <w:b w:val="0"/>
           <w:i w:val="0"/>
-          <w:sz w:val="28"/>
+          <w:sz w:val="24"/>
         </w:rPr>
         <w:t>{{EIK}}</w:t>
       </w:r>
@@ -306,7 +306,7 @@
           <w:rFonts w:ascii="Times New Roman" w:hAnsi="Times New Roman" w:cs="Times New Roman" w:eastAsia="Times New Roman"/>
           <w:b w:val="0"/>
           <w:i w:val="0"/>
-          <w:sz w:val="28"/>
+          <w:sz w:val="24"/>
         </w:rPr>
         <w:t xml:space="preserve">, постоянен/настоящ адрес или адрес на управление на юридическото лице: гр./с. </w:t>
       </w:r>
@@ -315,7 +315,7 @@
           <w:rFonts w:ascii="Times New Roman" w:hAnsi="Times New Roman" w:cs="Times New Roman" w:eastAsia="Times New Roman"/>
           <w:b w:val="0"/>
           <w:i w:val="0"/>
-          <w:sz w:val="28"/>
+          <w:sz w:val="24"/>
         </w:rPr>
         <w:t>{{CITY}}</w:t>
       </w:r>
@@ -324,7 +324,7 @@
           <w:rFonts w:ascii="Times New Roman" w:hAnsi="Times New Roman" w:cs="Times New Roman" w:eastAsia="Times New Roman"/>
           <w:b w:val="0"/>
           <w:i w:val="0"/>
-          <w:sz w:val="28"/>
+          <w:sz w:val="24"/>
         </w:rPr>
         <w:t xml:space="preserve">, община </w:t>
       </w:r>
@@ -333,7 +333,7 @@
           <w:rFonts w:ascii="Times New Roman" w:hAnsi="Times New Roman" w:cs="Times New Roman" w:eastAsia="Times New Roman"/>
           <w:b w:val="0"/>
           <w:i w:val="0"/>
-          <w:sz w:val="28"/>
+          <w:sz w:val="24"/>
         </w:rPr>
         <w:t>{{MUNICIPALITY}}</w:t>
       </w:r>
@@ -342,7 +342,7 @@
           <w:rFonts w:ascii="Times New Roman" w:hAnsi="Times New Roman" w:cs="Times New Roman" w:eastAsia="Times New Roman"/>
           <w:b w:val="0"/>
           <w:i w:val="0"/>
-          <w:sz w:val="28"/>
+          <w:sz w:val="24"/>
         </w:rPr>
         <w:t xml:space="preserve">, област </w:t>
       </w:r>
@@ -351,7 +351,7 @@
           <w:rFonts w:ascii="Times New Roman" w:hAnsi="Times New Roman" w:cs="Times New Roman" w:eastAsia="Times New Roman"/>
           <w:b w:val="0"/>
           <w:i w:val="0"/>
-          <w:sz w:val="28"/>
+          <w:sz w:val="24"/>
         </w:rPr>
         <w:t>{{OBLAST}}</w:t>
       </w:r>
@@ -360,7 +360,7 @@
           <w:rFonts w:ascii="Times New Roman" w:hAnsi="Times New Roman" w:cs="Times New Roman" w:eastAsia="Times New Roman"/>
           <w:b w:val="0"/>
           <w:i w:val="0"/>
-          <w:sz w:val="28"/>
+          <w:sz w:val="24"/>
         </w:rPr>
         <w:t xml:space="preserve">, ул. (ж.к.) </w:t>
       </w:r>
@@ -369,7 +369,7 @@
           <w:rFonts w:ascii="Times New Roman" w:hAnsi="Times New Roman" w:cs="Times New Roman" w:eastAsia="Times New Roman"/>
           <w:b w:val="0"/>
           <w:i w:val="0"/>
-          <w:sz w:val="28"/>
+          <w:sz w:val="24"/>
         </w:rPr>
         <w:t>{{STREET}}</w:t>
       </w:r>
@@ -378,7 +378,7 @@
           <w:rFonts w:ascii="Times New Roman" w:hAnsi="Times New Roman" w:cs="Times New Roman" w:eastAsia="Times New Roman"/>
           <w:b w:val="0"/>
           <w:i w:val="0"/>
-          <w:sz w:val="28"/>
+          <w:sz w:val="24"/>
         </w:rPr>
         <w:t xml:space="preserve">, тел.: </w:t>
       </w:r>
@@ -387,7 +387,7 @@
           <w:rFonts w:ascii="Times New Roman" w:hAnsi="Times New Roman" w:cs="Times New Roman" w:eastAsia="Times New Roman"/>
           <w:b w:val="0"/>
           <w:i w:val="0"/>
-          <w:sz w:val="28"/>
+          <w:sz w:val="24"/>
         </w:rPr>
         <w:t>{{PHONE}}</w:t>
       </w:r>
@@ -396,7 +396,7 @@
           <w:rFonts w:ascii="Times New Roman" w:hAnsi="Times New Roman" w:cs="Times New Roman" w:eastAsia="Times New Roman"/>
           <w:b w:val="0"/>
           <w:i w:val="0"/>
-          <w:sz w:val="28"/>
+          <w:sz w:val="24"/>
         </w:rPr>
         <w:t xml:space="preserve"> представляван/а от </w:t>
       </w:r>
@@ -405,7 +405,7 @@
           <w:rFonts w:ascii="Times New Roman" w:hAnsi="Times New Roman" w:cs="Times New Roman" w:eastAsia="Times New Roman"/>
           <w:b w:val="0"/>
           <w:i w:val="0"/>
-          <w:sz w:val="28"/>
+          <w:sz w:val="24"/>
         </w:rPr>
         <w:t>{{REP_NAME}}</w:t>
       </w:r>
@@ -420,7 +420,7 @@
           <w:rFonts w:ascii="Times New Roman" w:hAnsi="Times New Roman" w:cs="Times New Roman" w:eastAsia="Times New Roman"/>
           <w:b w:val="0"/>
           <w:i/>
-          <w:sz w:val="20"/>
+          <w:sz w:val="18"/>
         </w:rPr>
         <w:t>(трите имена на упълномощен или законен представител на юридическото лице)</w:t>
       </w:r>
@@ -434,7 +434,7 @@
           <w:rFonts w:ascii="Times New Roman" w:hAnsi="Times New Roman" w:cs="Times New Roman" w:eastAsia="Times New Roman"/>
           <w:b w:val="0"/>
           <w:i w:val="0"/>
-          <w:sz w:val="28"/>
+          <w:sz w:val="24"/>
         </w:rPr>
         <w:t xml:space="preserve">e-mail: </w:t>
       </w:r>
@@ -443,7 +443,7 @@
           <w:rFonts w:ascii="Times New Roman" w:hAnsi="Times New Roman" w:cs="Times New Roman" w:eastAsia="Times New Roman"/>
           <w:b w:val="0"/>
           <w:i w:val="0"/>
-          <w:sz w:val="28"/>
+          <w:sz w:val="24"/>
         </w:rPr>
         <w:t>{{EMAIL}}</w:t>
       </w:r>
@@ -457,7 +457,7 @@
           <w:rFonts w:ascii="Times New Roman" w:hAnsi="Times New Roman" w:cs="Times New Roman" w:eastAsia="Times New Roman"/>
           <w:b/>
           <w:i w:val="0"/>
-          <w:sz w:val="28"/>
+          <w:sz w:val="24"/>
         </w:rPr>
         <w:t>УВАЖАЕМА ГОСПОЖО КМЕТ,</w:t>
       </w:r>
@@ -471,7 +471,7 @@
           <w:rFonts w:ascii="Times New Roman" w:hAnsi="Times New Roman" w:cs="Times New Roman" w:eastAsia="Times New Roman"/>
           <w:b w:val="0"/>
           <w:i w:val="0"/>
-          <w:sz w:val="28"/>
+          <w:sz w:val="24"/>
         </w:rPr>
         <w:t>Заявявам желание за предоставяне за ползване на следното помещение в Многофункционална спортна зала „Троян“</w:t>
       </w:r>
@@ -485,7 +485,7 @@
           <w:rFonts w:ascii="Times New Roman" w:hAnsi="Times New Roman" w:cs="Times New Roman" w:eastAsia="Times New Roman"/>
           <w:b w:val="0"/>
           <w:i w:val="0"/>
-          <w:sz w:val="28"/>
+          <w:sz w:val="24"/>
         </w:rPr>
         <w:t>{{CHK_HALL_SPORT}}</w:t>
       </w:r>
@@ -494,7 +494,7 @@
           <w:rFonts w:ascii="Times New Roman" w:hAnsi="Times New Roman" w:cs="Times New Roman" w:eastAsia="Times New Roman"/>
           <w:b w:val="0"/>
           <w:i w:val="0"/>
-          <w:sz w:val="28"/>
+          <w:sz w:val="24"/>
         </w:rPr>
         <w:t xml:space="preserve"> Спортна зала;   </w:t>
       </w:r>
@@ -503,7 +503,7 @@
           <w:rFonts w:ascii="Times New Roman" w:hAnsi="Times New Roman" w:cs="Times New Roman" w:eastAsia="Times New Roman"/>
           <w:b w:val="0"/>
           <w:i w:val="0"/>
-          <w:sz w:val="28"/>
+          <w:sz w:val="24"/>
         </w:rPr>
         <w:t>{{CHK_HALL_TRAIN}}</w:t>
       </w:r>
@@ -512,7 +512,7 @@
           <w:rFonts w:ascii="Times New Roman" w:hAnsi="Times New Roman" w:cs="Times New Roman" w:eastAsia="Times New Roman"/>
           <w:b w:val="0"/>
           <w:i w:val="0"/>
-          <w:sz w:val="28"/>
+          <w:sz w:val="24"/>
         </w:rPr>
         <w:t xml:space="preserve"> Тренировъчна зала;  </w:t>
       </w:r>
@@ -521,7 +521,7 @@
           <w:rFonts w:ascii="Times New Roman" w:hAnsi="Times New Roman" w:cs="Times New Roman" w:eastAsia="Times New Roman"/>
           <w:b w:val="0"/>
           <w:i w:val="0"/>
-          <w:sz w:val="28"/>
+          <w:sz w:val="24"/>
         </w:rPr>
         <w:t>{{CHK_HALL_CONF}}</w:t>
       </w:r>
@@ -530,7 +530,7 @@
           <w:rFonts w:ascii="Times New Roman" w:hAnsi="Times New Roman" w:cs="Times New Roman" w:eastAsia="Times New Roman"/>
           <w:b w:val="0"/>
           <w:i w:val="0"/>
-          <w:sz w:val="28"/>
+          <w:sz w:val="24"/>
         </w:rPr>
         <w:t xml:space="preserve"> Конферентна зала (30 места)</w:t>
       </w:r>
@@ -544,7 +544,7 @@
           <w:rFonts w:ascii="Times New Roman" w:hAnsi="Times New Roman" w:cs="Times New Roman" w:eastAsia="Times New Roman"/>
           <w:b w:val="0"/>
           <w:i w:val="0"/>
-          <w:sz w:val="28"/>
+          <w:sz w:val="24"/>
         </w:rPr>
         <w:t xml:space="preserve">за провеждане на   </w:t>
       </w:r>
@@ -553,7 +553,7 @@
           <w:rFonts w:ascii="Times New Roman" w:hAnsi="Times New Roman" w:cs="Times New Roman" w:eastAsia="Times New Roman"/>
           <w:b w:val="0"/>
           <w:i w:val="0"/>
-          <w:sz w:val="28"/>
+          <w:sz w:val="24"/>
         </w:rPr>
         <w:t>{{EVENT_TITLE}}</w:t>
       </w:r>
@@ -568,7 +568,7 @@
           <w:rFonts w:ascii="Times New Roman" w:hAnsi="Times New Roman" w:cs="Times New Roman" w:eastAsia="Times New Roman"/>
           <w:b w:val="0"/>
           <w:i/>
-          <w:sz w:val="20"/>
+          <w:sz w:val="18"/>
         </w:rPr>
         <w:t>(наименование на събитието)</w:t>
       </w:r>
@@ -582,7 +582,7 @@
           <w:rFonts w:ascii="Times New Roman" w:hAnsi="Times New Roman" w:cs="Times New Roman" w:eastAsia="Times New Roman"/>
           <w:b w:val="0"/>
           <w:i w:val="0"/>
-          <w:sz w:val="28"/>
+          <w:sz w:val="24"/>
         </w:rPr>
         <w:t>вид на събитието</w:t>
       </w:r>
@@ -596,7 +596,7 @@
           <w:rFonts w:ascii="Times New Roman" w:hAnsi="Times New Roman" w:cs="Times New Roman" w:eastAsia="Times New Roman"/>
           <w:b w:val="0"/>
           <w:i w:val="0"/>
-          <w:sz w:val="28"/>
+          <w:sz w:val="24"/>
         </w:rPr>
         <w:t>{{CHK_KIND_TRAIN}}</w:t>
       </w:r>
@@ -605,7 +605,7 @@
           <w:rFonts w:ascii="Times New Roman" w:hAnsi="Times New Roman" w:cs="Times New Roman" w:eastAsia="Times New Roman"/>
           <w:b w:val="0"/>
           <w:i w:val="0"/>
-          <w:sz w:val="28"/>
+          <w:sz w:val="24"/>
         </w:rPr>
         <w:t xml:space="preserve"> Тренировки;</w:t>
       </w:r>
@@ -619,7 +619,7 @@
           <w:rFonts w:ascii="Times New Roman" w:hAnsi="Times New Roman" w:cs="Times New Roman" w:eastAsia="Times New Roman"/>
           <w:b w:val="0"/>
           <w:i w:val="0"/>
-          <w:sz w:val="28"/>
+          <w:sz w:val="24"/>
         </w:rPr>
         <w:t>{{CHK_KIND_TOURN}}</w:t>
       </w:r>
@@ -628,7 +628,7 @@
           <w:rFonts w:ascii="Times New Roman" w:hAnsi="Times New Roman" w:cs="Times New Roman" w:eastAsia="Times New Roman"/>
           <w:b w:val="0"/>
           <w:i w:val="0"/>
-          <w:sz w:val="28"/>
+          <w:sz w:val="24"/>
         </w:rPr>
         <w:t xml:space="preserve"> Спортни турнири/състезания;</w:t>
       </w:r>
@@ -642,7 +642,7 @@
           <w:rFonts w:ascii="Times New Roman" w:hAnsi="Times New Roman" w:cs="Times New Roman" w:eastAsia="Times New Roman"/>
           <w:b w:val="0"/>
           <w:i w:val="0"/>
-          <w:sz w:val="28"/>
+          <w:sz w:val="24"/>
         </w:rPr>
         <w:t>{{CHK_KIND_OTHER}}</w:t>
       </w:r>
@@ -651,7 +651,7 @@
           <w:rFonts w:ascii="Times New Roman" w:hAnsi="Times New Roman" w:cs="Times New Roman" w:eastAsia="Times New Roman"/>
           <w:b w:val="0"/>
           <w:i w:val="0"/>
-          <w:sz w:val="28"/>
+          <w:sz w:val="24"/>
         </w:rPr>
         <w:t xml:space="preserve"> Образователни, културни или социални събития и дейности;</w:t>
       </w:r>
@@ -665,7 +665,7 @@
           <w:rFonts w:ascii="Times New Roman" w:hAnsi="Times New Roman" w:cs="Times New Roman" w:eastAsia="Times New Roman"/>
           <w:b w:val="0"/>
           <w:i w:val="0"/>
-          <w:sz w:val="28"/>
+          <w:sz w:val="24"/>
         </w:rPr>
         <w:t>дати и часове за ползване:</w:t>
       </w:r>
@@ -698,7 +698,7 @@
                 <w:rFonts w:ascii="Times New Roman" w:hAnsi="Times New Roman" w:cs="Times New Roman" w:eastAsia="Times New Roman"/>
                 <w:b/>
                 <w:i w:val="0"/>
-                <w:sz w:val="20"/>
+                <w:sz w:val="18"/>
               </w:rPr>
               <w:t>Дата</w:t>
             </w:r>
@@ -718,7 +718,7 @@
                 <w:rFonts w:ascii="Times New Roman" w:hAnsi="Times New Roman" w:cs="Times New Roman" w:eastAsia="Times New Roman"/>
                 <w:b/>
                 <w:i w:val="0"/>
-                <w:sz w:val="20"/>
+                <w:sz w:val="18"/>
               </w:rPr>
               <w:t>Начален час</w:t>
             </w:r>
@@ -738,7 +738,7 @@
                 <w:rFonts w:ascii="Times New Roman" w:hAnsi="Times New Roman" w:cs="Times New Roman" w:eastAsia="Times New Roman"/>
                 <w:b/>
                 <w:i w:val="0"/>
-                <w:sz w:val="20"/>
+                <w:sz w:val="18"/>
               </w:rPr>
               <w:t>Краен час</w:t>
             </w:r>
@@ -758,7 +758,7 @@
                 <w:rFonts w:ascii="Times New Roman" w:hAnsi="Times New Roman" w:cs="Times New Roman" w:eastAsia="Times New Roman"/>
                 <w:b/>
                 <w:i w:val="0"/>
-                <w:sz w:val="20"/>
+                <w:sz w:val="18"/>
               </w:rPr>
               <w:t>Целодневно ползване</w:t>
               <w:br/>
@@ -784,7 +784,7 @@
                 <w:rFonts w:ascii="Times New Roman" w:hAnsi="Times New Roman" w:cs="Times New Roman" w:eastAsia="Times New Roman"/>
                 <w:b w:val="0"/>
                 <w:i w:val="0"/>
-                <w:sz w:val="28"/>
+                <w:sz w:val="24"/>
               </w:rPr>
             </w:r>
           </w:p>
@@ -803,7 +803,7 @@
                 <w:rFonts w:ascii="Times New Roman" w:hAnsi="Times New Roman" w:cs="Times New Roman" w:eastAsia="Times New Roman"/>
                 <w:b w:val="0"/>
                 <w:i w:val="0"/>
-                <w:sz w:val="28"/>
+                <w:sz w:val="24"/>
               </w:rPr>
             </w:r>
           </w:p>
@@ -822,7 +822,7 @@
                 <w:rFonts w:ascii="Times New Roman" w:hAnsi="Times New Roman" w:cs="Times New Roman" w:eastAsia="Times New Roman"/>
                 <w:b w:val="0"/>
                 <w:i w:val="0"/>
-                <w:sz w:val="28"/>
+                <w:sz w:val="24"/>
               </w:rPr>
             </w:r>
           </w:p>
@@ -841,7 +841,7 @@
                 <w:rFonts w:ascii="Times New Roman" w:hAnsi="Times New Roman" w:cs="Times New Roman" w:eastAsia="Times New Roman"/>
                 <w:b w:val="0"/>
                 <w:i w:val="0"/>
-                <w:sz w:val="28"/>
+                <w:sz w:val="24"/>
               </w:rPr>
               <w:t>☐</w:t>
             </w:r>
@@ -863,7 +863,7 @@
                 <w:rFonts w:ascii="Times New Roman" w:hAnsi="Times New Roman" w:cs="Times New Roman" w:eastAsia="Times New Roman"/>
                 <w:b w:val="0"/>
                 <w:i w:val="0"/>
-                <w:sz w:val="28"/>
+                <w:sz w:val="24"/>
               </w:rPr>
             </w:r>
           </w:p>
@@ -882,7 +882,7 @@
                 <w:rFonts w:ascii="Times New Roman" w:hAnsi="Times New Roman" w:cs="Times New Roman" w:eastAsia="Times New Roman"/>
                 <w:b w:val="0"/>
                 <w:i w:val="0"/>
-                <w:sz w:val="28"/>
+                <w:sz w:val="24"/>
               </w:rPr>
             </w:r>
           </w:p>
@@ -901,7 +901,7 @@
                 <w:rFonts w:ascii="Times New Roman" w:hAnsi="Times New Roman" w:cs="Times New Roman" w:eastAsia="Times New Roman"/>
                 <w:b w:val="0"/>
                 <w:i w:val="0"/>
-                <w:sz w:val="28"/>
+                <w:sz w:val="24"/>
               </w:rPr>
             </w:r>
           </w:p>
@@ -920,7 +920,7 @@
                 <w:rFonts w:ascii="Times New Roman" w:hAnsi="Times New Roman" w:cs="Times New Roman" w:eastAsia="Times New Roman"/>
                 <w:b w:val="0"/>
                 <w:i w:val="0"/>
-                <w:sz w:val="28"/>
+                <w:sz w:val="24"/>
               </w:rPr>
               <w:t>☐</w:t>
             </w:r>
@@ -942,7 +942,7 @@
                 <w:rFonts w:ascii="Times New Roman" w:hAnsi="Times New Roman" w:cs="Times New Roman" w:eastAsia="Times New Roman"/>
                 <w:b w:val="0"/>
                 <w:i w:val="0"/>
-                <w:sz w:val="28"/>
+                <w:sz w:val="24"/>
               </w:rPr>
             </w:r>
           </w:p>
@@ -961,7 +961,7 @@
                 <w:rFonts w:ascii="Times New Roman" w:hAnsi="Times New Roman" w:cs="Times New Roman" w:eastAsia="Times New Roman"/>
                 <w:b w:val="0"/>
                 <w:i w:val="0"/>
-                <w:sz w:val="28"/>
+                <w:sz w:val="24"/>
               </w:rPr>
             </w:r>
           </w:p>
@@ -980,7 +980,7 @@
                 <w:rFonts w:ascii="Times New Roman" w:hAnsi="Times New Roman" w:cs="Times New Roman" w:eastAsia="Times New Roman"/>
                 <w:b w:val="0"/>
                 <w:i w:val="0"/>
-                <w:sz w:val="28"/>
+                <w:sz w:val="24"/>
               </w:rPr>
             </w:r>
           </w:p>
@@ -999,7 +999,7 @@
                 <w:rFonts w:ascii="Times New Roman" w:hAnsi="Times New Roman" w:cs="Times New Roman" w:eastAsia="Times New Roman"/>
                 <w:b w:val="0"/>
                 <w:i w:val="0"/>
-                <w:sz w:val="28"/>
+                <w:sz w:val="24"/>
               </w:rPr>
               <w:t>☐</w:t>
             </w:r>
@@ -1021,7 +1021,7 @@
                 <w:rFonts w:ascii="Times New Roman" w:hAnsi="Times New Roman" w:cs="Times New Roman" w:eastAsia="Times New Roman"/>
                 <w:b w:val="0"/>
                 <w:i w:val="0"/>
-                <w:sz w:val="28"/>
+                <w:sz w:val="24"/>
               </w:rPr>
             </w:r>
           </w:p>
@@ -1040,7 +1040,7 @@
                 <w:rFonts w:ascii="Times New Roman" w:hAnsi="Times New Roman" w:cs="Times New Roman" w:eastAsia="Times New Roman"/>
                 <w:b w:val="0"/>
                 <w:i w:val="0"/>
-                <w:sz w:val="28"/>
+                <w:sz w:val="24"/>
               </w:rPr>
             </w:r>
           </w:p>
@@ -1059,7 +1059,7 @@
                 <w:rFonts w:ascii="Times New Roman" w:hAnsi="Times New Roman" w:cs="Times New Roman" w:eastAsia="Times New Roman"/>
                 <w:b w:val="0"/>
                 <w:i w:val="0"/>
-                <w:sz w:val="28"/>
+                <w:sz w:val="24"/>
               </w:rPr>
             </w:r>
           </w:p>
@@ -1078,7 +1078,7 @@
                 <w:rFonts w:ascii="Times New Roman" w:hAnsi="Times New Roman" w:cs="Times New Roman" w:eastAsia="Times New Roman"/>
                 <w:b w:val="0"/>
                 <w:i w:val="0"/>
-                <w:sz w:val="28"/>
+                <w:sz w:val="24"/>
               </w:rPr>
               <w:t>☐</w:t>
             </w:r>
@@ -1100,7 +1100,7 @@
                 <w:rFonts w:ascii="Times New Roman" w:hAnsi="Times New Roman" w:cs="Times New Roman" w:eastAsia="Times New Roman"/>
                 <w:b w:val="0"/>
                 <w:i w:val="0"/>
-                <w:sz w:val="28"/>
+                <w:sz w:val="24"/>
               </w:rPr>
             </w:r>
           </w:p>
@@ -1119,7 +1119,7 @@
                 <w:rFonts w:ascii="Times New Roman" w:hAnsi="Times New Roman" w:cs="Times New Roman" w:eastAsia="Times New Roman"/>
                 <w:b w:val="0"/>
                 <w:i w:val="0"/>
-                <w:sz w:val="28"/>
+                <w:sz w:val="24"/>
               </w:rPr>
             </w:r>
           </w:p>
@@ -1138,7 +1138,7 @@
                 <w:rFonts w:ascii="Times New Roman" w:hAnsi="Times New Roman" w:cs="Times New Roman" w:eastAsia="Times New Roman"/>
                 <w:b w:val="0"/>
                 <w:i w:val="0"/>
-                <w:sz w:val="28"/>
+                <w:sz w:val="24"/>
               </w:rPr>
             </w:r>
           </w:p>
@@ -1157,7 +1157,7 @@
                 <w:rFonts w:ascii="Times New Roman" w:hAnsi="Times New Roman" w:cs="Times New Roman" w:eastAsia="Times New Roman"/>
                 <w:b w:val="0"/>
                 <w:i w:val="0"/>
-                <w:sz w:val="28"/>
+                <w:sz w:val="24"/>
               </w:rPr>
               <w:t>☐</w:t>
             </w:r>
@@ -1179,7 +1179,7 @@
                 <w:rFonts w:ascii="Times New Roman" w:hAnsi="Times New Roman" w:cs="Times New Roman" w:eastAsia="Times New Roman"/>
                 <w:b w:val="0"/>
                 <w:i w:val="0"/>
-                <w:sz w:val="28"/>
+                <w:sz w:val="24"/>
               </w:rPr>
             </w:r>
           </w:p>
@@ -1198,7 +1198,7 @@
                 <w:rFonts w:ascii="Times New Roman" w:hAnsi="Times New Roman" w:cs="Times New Roman" w:eastAsia="Times New Roman"/>
                 <w:b w:val="0"/>
                 <w:i w:val="0"/>
-                <w:sz w:val="28"/>
+                <w:sz w:val="24"/>
               </w:rPr>
             </w:r>
           </w:p>
@@ -1217,7 +1217,7 @@
                 <w:rFonts w:ascii="Times New Roman" w:hAnsi="Times New Roman" w:cs="Times New Roman" w:eastAsia="Times New Roman"/>
                 <w:b w:val="0"/>
                 <w:i w:val="0"/>
-                <w:sz w:val="28"/>
+                <w:sz w:val="24"/>
               </w:rPr>
             </w:r>
           </w:p>
@@ -1236,7 +1236,7 @@
                 <w:rFonts w:ascii="Times New Roman" w:hAnsi="Times New Roman" w:cs="Times New Roman" w:eastAsia="Times New Roman"/>
                 <w:b w:val="0"/>
                 <w:i w:val="0"/>
-                <w:sz w:val="28"/>
+                <w:sz w:val="24"/>
               </w:rPr>
               <w:t>☐</w:t>
             </w:r>
@@ -1258,7 +1258,7 @@
                 <w:rFonts w:ascii="Times New Roman" w:hAnsi="Times New Roman" w:cs="Times New Roman" w:eastAsia="Times New Roman"/>
                 <w:b w:val="0"/>
                 <w:i w:val="0"/>
-                <w:sz w:val="28"/>
+                <w:sz w:val="24"/>
               </w:rPr>
             </w:r>
           </w:p>
@@ -1277,7 +1277,7 @@
                 <w:rFonts w:ascii="Times New Roman" w:hAnsi="Times New Roman" w:cs="Times New Roman" w:eastAsia="Times New Roman"/>
                 <w:b w:val="0"/>
                 <w:i w:val="0"/>
-                <w:sz w:val="28"/>
+                <w:sz w:val="24"/>
               </w:rPr>
             </w:r>
           </w:p>
@@ -1296,7 +1296,7 @@
                 <w:rFonts w:ascii="Times New Roman" w:hAnsi="Times New Roman" w:cs="Times New Roman" w:eastAsia="Times New Roman"/>
                 <w:b w:val="0"/>
                 <w:i w:val="0"/>
-                <w:sz w:val="28"/>
+                <w:sz w:val="24"/>
               </w:rPr>
             </w:r>
           </w:p>
@@ -1315,7 +1315,7 @@
                 <w:rFonts w:ascii="Times New Roman" w:hAnsi="Times New Roman" w:cs="Times New Roman" w:eastAsia="Times New Roman"/>
                 <w:b w:val="0"/>
                 <w:i w:val="0"/>
-                <w:sz w:val="28"/>
+                <w:sz w:val="24"/>
               </w:rPr>
               <w:t>☐</w:t>
             </w:r>
@@ -1337,7 +1337,7 @@
                 <w:rFonts w:ascii="Times New Roman" w:hAnsi="Times New Roman" w:cs="Times New Roman" w:eastAsia="Times New Roman"/>
                 <w:b w:val="0"/>
                 <w:i w:val="0"/>
-                <w:sz w:val="28"/>
+                <w:sz w:val="24"/>
               </w:rPr>
             </w:r>
           </w:p>
@@ -1356,7 +1356,7 @@
                 <w:rFonts w:ascii="Times New Roman" w:hAnsi="Times New Roman" w:cs="Times New Roman" w:eastAsia="Times New Roman"/>
                 <w:b w:val="0"/>
                 <w:i w:val="0"/>
-                <w:sz w:val="28"/>
+                <w:sz w:val="24"/>
               </w:rPr>
             </w:r>
           </w:p>
@@ -1375,7 +1375,7 @@
                 <w:rFonts w:ascii="Times New Roman" w:hAnsi="Times New Roman" w:cs="Times New Roman" w:eastAsia="Times New Roman"/>
                 <w:b w:val="0"/>
                 <w:i w:val="0"/>
-                <w:sz w:val="28"/>
+                <w:sz w:val="24"/>
               </w:rPr>
             </w:r>
           </w:p>
@@ -1394,7 +1394,7 @@
                 <w:rFonts w:ascii="Times New Roman" w:hAnsi="Times New Roman" w:cs="Times New Roman" w:eastAsia="Times New Roman"/>
                 <w:b w:val="0"/>
                 <w:i w:val="0"/>
-                <w:sz w:val="28"/>
+                <w:sz w:val="24"/>
               </w:rPr>
               <w:t>☐</w:t>
             </w:r>
@@ -1416,7 +1416,7 @@
                 <w:rFonts w:ascii="Times New Roman" w:hAnsi="Times New Roman" w:cs="Times New Roman" w:eastAsia="Times New Roman"/>
                 <w:b w:val="0"/>
                 <w:i w:val="0"/>
-                <w:sz w:val="28"/>
+                <w:sz w:val="24"/>
               </w:rPr>
             </w:r>
           </w:p>
@@ -1435,7 +1435,7 @@
                 <w:rFonts w:ascii="Times New Roman" w:hAnsi="Times New Roman" w:cs="Times New Roman" w:eastAsia="Times New Roman"/>
                 <w:b w:val="0"/>
                 <w:i w:val="0"/>
-                <w:sz w:val="28"/>
+                <w:sz w:val="24"/>
               </w:rPr>
             </w:r>
           </w:p>
@@ -1454,7 +1454,7 @@
                 <w:rFonts w:ascii="Times New Roman" w:hAnsi="Times New Roman" w:cs="Times New Roman" w:eastAsia="Times New Roman"/>
                 <w:b w:val="0"/>
                 <w:i w:val="0"/>
-                <w:sz w:val="28"/>
+                <w:sz w:val="24"/>
               </w:rPr>
             </w:r>
           </w:p>
@@ -1473,7 +1473,7 @@
                 <w:rFonts w:ascii="Times New Roman" w:hAnsi="Times New Roman" w:cs="Times New Roman" w:eastAsia="Times New Roman"/>
                 <w:b w:val="0"/>
                 <w:i w:val="0"/>
-                <w:sz w:val="28"/>
+                <w:sz w:val="24"/>
               </w:rPr>
               <w:t>☐</w:t>
             </w:r>
@@ -1495,7 +1495,7 @@
                 <w:rFonts w:ascii="Times New Roman" w:hAnsi="Times New Roman" w:cs="Times New Roman" w:eastAsia="Times New Roman"/>
                 <w:b w:val="0"/>
                 <w:i w:val="0"/>
-                <w:sz w:val="28"/>
+                <w:sz w:val="24"/>
               </w:rPr>
             </w:r>
           </w:p>
@@ -1514,7 +1514,7 @@
                 <w:rFonts w:ascii="Times New Roman" w:hAnsi="Times New Roman" w:cs="Times New Roman" w:eastAsia="Times New Roman"/>
                 <w:b w:val="0"/>
                 <w:i w:val="0"/>
-                <w:sz w:val="28"/>
+                <w:sz w:val="24"/>
               </w:rPr>
             </w:r>
           </w:p>
@@ -1533,7 +1533,7 @@
                 <w:rFonts w:ascii="Times New Roman" w:hAnsi="Times New Roman" w:cs="Times New Roman" w:eastAsia="Times New Roman"/>
                 <w:b w:val="0"/>
                 <w:i w:val="0"/>
-                <w:sz w:val="28"/>
+                <w:sz w:val="24"/>
               </w:rPr>
             </w:r>
           </w:p>
@@ -1552,7 +1552,7 @@
                 <w:rFonts w:ascii="Times New Roman" w:hAnsi="Times New Roman" w:cs="Times New Roman" w:eastAsia="Times New Roman"/>
                 <w:b w:val="0"/>
                 <w:i w:val="0"/>
-                <w:sz w:val="28"/>
+                <w:sz w:val="24"/>
               </w:rPr>
               <w:t>☐</w:t>
             </w:r>
@@ -1574,7 +1574,7 @@
           <w:rFonts w:ascii="Times New Roman" w:hAnsi="Times New Roman" w:cs="Times New Roman" w:eastAsia="Times New Roman"/>
           <w:b w:val="0"/>
           <w:i w:val="0"/>
-          <w:sz w:val="28"/>
+          <w:sz w:val="24"/>
         </w:rPr>
         <w:t>За провеждането на събитието е необходимо:</w:t>
       </w:r>
@@ -1588,7 +1588,7 @@
           <w:rFonts w:ascii="Times New Roman" w:hAnsi="Times New Roman" w:cs="Times New Roman" w:eastAsia="Times New Roman"/>
           <w:b w:val="0"/>
           <w:i w:val="0"/>
-          <w:sz w:val="22"/>
+          <w:sz w:val="20"/>
         </w:rPr>
         <w:t>{{CHK_EQ_BASKET}}</w:t>
       </w:r>
@@ -1597,7 +1597,7 @@
           <w:rFonts w:ascii="Times New Roman" w:hAnsi="Times New Roman" w:cs="Times New Roman" w:eastAsia="Times New Roman"/>
           <w:b w:val="0"/>
           <w:i w:val="0"/>
-          <w:sz w:val="22"/>
+          <w:sz w:val="20"/>
         </w:rPr>
         <w:t xml:space="preserve"> Оборудване и спортни съоръжения - Баскетбол;   </w:t>
       </w:r>
@@ -1606,7 +1606,7 @@
           <w:rFonts w:ascii="Times New Roman" w:hAnsi="Times New Roman" w:cs="Times New Roman" w:eastAsia="Times New Roman"/>
           <w:b w:val="0"/>
           <w:i w:val="0"/>
-          <w:sz w:val="22"/>
+          <w:sz w:val="20"/>
         </w:rPr>
         <w:t>{{CHK_EQ_VOLLEY}}</w:t>
       </w:r>
@@ -1615,7 +1615,7 @@
           <w:rFonts w:ascii="Times New Roman" w:hAnsi="Times New Roman" w:cs="Times New Roman" w:eastAsia="Times New Roman"/>
           <w:b w:val="0"/>
           <w:i w:val="0"/>
-          <w:sz w:val="22"/>
+          <w:sz w:val="20"/>
         </w:rPr>
         <w:t xml:space="preserve"> Оборудване и спортни съоръжения – Волейбол;   </w:t>
       </w:r>
@@ -1624,7 +1624,7 @@
           <w:rFonts w:ascii="Times New Roman" w:hAnsi="Times New Roman" w:cs="Times New Roman" w:eastAsia="Times New Roman"/>
           <w:b w:val="0"/>
           <w:i w:val="0"/>
-          <w:sz w:val="22"/>
+          <w:sz w:val="20"/>
         </w:rPr>
         <w:t>{{CHK_EQ_TENNIS}}</w:t>
       </w:r>
@@ -1633,7 +1633,7 @@
           <w:rFonts w:ascii="Times New Roman" w:hAnsi="Times New Roman" w:cs="Times New Roman" w:eastAsia="Times New Roman"/>
           <w:b w:val="0"/>
           <w:i w:val="0"/>
-          <w:sz w:val="22"/>
+          <w:sz w:val="20"/>
         </w:rPr>
         <w:t xml:space="preserve"> Оборудване и спортни съоръжения – Тенис;    </w:t>
       </w:r>
@@ -1642,7 +1642,7 @@
           <w:rFonts w:ascii="Times New Roman" w:hAnsi="Times New Roman" w:cs="Times New Roman" w:eastAsia="Times New Roman"/>
           <w:b w:val="0"/>
           <w:i w:val="0"/>
-          <w:sz w:val="22"/>
+          <w:sz w:val="20"/>
         </w:rPr>
         <w:t>{{CHK_EQ_VINYL}}</w:t>
       </w:r>
@@ -1651,7 +1651,7 @@
           <w:rFonts w:ascii="Times New Roman" w:hAnsi="Times New Roman" w:cs="Times New Roman" w:eastAsia="Times New Roman"/>
           <w:b w:val="0"/>
           <w:i w:val="0"/>
-          <w:sz w:val="22"/>
+          <w:sz w:val="20"/>
         </w:rPr>
         <w:t xml:space="preserve"> Монтиране на предпазна винилова настилка;   </w:t>
       </w:r>
@@ -1660,7 +1660,7 @@
           <w:rFonts w:ascii="Times New Roman" w:hAnsi="Times New Roman" w:cs="Times New Roman" w:eastAsia="Times New Roman"/>
           <w:b w:val="0"/>
           <w:i w:val="0"/>
-          <w:sz w:val="22"/>
+          <w:sz w:val="20"/>
         </w:rPr>
         <w:t>{{CHK_EQ_SOUND}}</w:t>
       </w:r>
@@ -1669,7 +1669,7 @@
           <w:rFonts w:ascii="Times New Roman" w:hAnsi="Times New Roman" w:cs="Times New Roman" w:eastAsia="Times New Roman"/>
           <w:b w:val="0"/>
           <w:i w:val="0"/>
-          <w:sz w:val="22"/>
+          <w:sz w:val="20"/>
         </w:rPr>
         <w:t xml:space="preserve"> Озвучителна система (оповестителна);   </w:t>
       </w:r>
@@ -1678,7 +1678,7 @@
           <w:rFonts w:ascii="Times New Roman" w:hAnsi="Times New Roman" w:cs="Times New Roman" w:eastAsia="Times New Roman"/>
           <w:b w:val="0"/>
           <w:i w:val="0"/>
-          <w:sz w:val="22"/>
+          <w:sz w:val="20"/>
         </w:rPr>
         <w:t>{{CHK_EQ_SCREEN}}</w:t>
       </w:r>
@@ -1687,7 +1687,7 @@
           <w:rFonts w:ascii="Times New Roman" w:hAnsi="Times New Roman" w:cs="Times New Roman" w:eastAsia="Times New Roman"/>
           <w:b w:val="0"/>
           <w:i w:val="0"/>
-          <w:sz w:val="22"/>
+          <w:sz w:val="20"/>
         </w:rPr>
         <w:t xml:space="preserve"> Лед екран, табла за резултати;</w:t>
       </w:r>
@@ -1701,7 +1701,7 @@
           <w:rFonts w:ascii="Times New Roman" w:hAnsi="Times New Roman" w:cs="Times New Roman" w:eastAsia="Times New Roman"/>
           <w:b w:val="0"/>
           <w:i w:val="0"/>
-          <w:sz w:val="28"/>
+          <w:sz w:val="24"/>
         </w:rPr>
         <w:t xml:space="preserve">Изисква се преустройство на залата:  </w:t>
       </w:r>
@@ -1710,7 +1710,7 @@
           <w:rFonts w:ascii="Times New Roman" w:hAnsi="Times New Roman" w:cs="Times New Roman" w:eastAsia="Times New Roman"/>
           <w:b w:val="0"/>
           <w:i w:val="0"/>
-          <w:sz w:val="28"/>
+          <w:sz w:val="24"/>
         </w:rPr>
         <w:t>{{CHK_REBUILD_YES}}</w:t>
       </w:r>
@@ -1719,7 +1719,7 @@
           <w:rFonts w:ascii="Times New Roman" w:hAnsi="Times New Roman" w:cs="Times New Roman" w:eastAsia="Times New Roman"/>
           <w:b w:val="0"/>
           <w:i w:val="0"/>
-          <w:sz w:val="28"/>
+          <w:sz w:val="24"/>
         </w:rPr>
         <w:t xml:space="preserve"> ДА;  </w:t>
       </w:r>
@@ -1728,7 +1728,7 @@
           <w:rFonts w:ascii="Times New Roman" w:hAnsi="Times New Roman" w:cs="Times New Roman" w:eastAsia="Times New Roman"/>
           <w:b w:val="0"/>
           <w:i w:val="0"/>
-          <w:sz w:val="28"/>
+          <w:sz w:val="24"/>
         </w:rPr>
         <w:t>{{CHK_REBUILD_NO}}</w:t>
       </w:r>
@@ -1737,7 +1737,7 @@
           <w:rFonts w:ascii="Times New Roman" w:hAnsi="Times New Roman" w:cs="Times New Roman" w:eastAsia="Times New Roman"/>
           <w:b w:val="0"/>
           <w:i w:val="0"/>
-          <w:sz w:val="28"/>
+          <w:sz w:val="24"/>
         </w:rPr>
         <w:t xml:space="preserve"> НЕ</w:t>
       </w:r>
@@ -1751,7 +1751,7 @@
           <w:rFonts w:ascii="Times New Roman" w:hAnsi="Times New Roman" w:cs="Times New Roman" w:eastAsia="Times New Roman"/>
           <w:b w:val="0"/>
           <w:i/>
-          <w:sz w:val="20"/>
+          <w:sz w:val="18"/>
         </w:rPr>
         <w:t>(поставяне на предпазна винилова настилка, внасяне, монтаж и демонтаж на сцена, подиуми и сценично оборудване)</w:t>
       </w:r>
@@ -1765,7 +1765,7 @@
           <w:rFonts w:ascii="Times New Roman" w:hAnsi="Times New Roman" w:cs="Times New Roman" w:eastAsia="Times New Roman"/>
           <w:b w:val="0"/>
           <w:i w:val="0"/>
-          <w:sz w:val="28"/>
+          <w:sz w:val="24"/>
         </w:rPr>
         <w:t>Други бележки: ........................................................................</w:t>
       </w:r>
@@ -1779,7 +1779,7 @@
           <w:rFonts w:ascii="Times New Roman" w:hAnsi="Times New Roman" w:cs="Times New Roman" w:eastAsia="Times New Roman"/>
           <w:b w:val="0"/>
           <w:i w:val="0"/>
-          <w:sz w:val="28"/>
+          <w:sz w:val="24"/>
         </w:rPr>
         <w:t>........................................................................................</w:t>
       </w:r>
@@ -1793,7 +1793,7 @@
           <w:rFonts w:ascii="Times New Roman" w:hAnsi="Times New Roman" w:cs="Times New Roman" w:eastAsia="Times New Roman"/>
           <w:b w:val="0"/>
           <w:i w:val="0"/>
-          <w:sz w:val="28"/>
+          <w:sz w:val="24"/>
         </w:rPr>
         <w:t>........................................................................................</w:t>
       </w:r>
@@ -1807,7 +1807,7 @@
           <w:rFonts w:ascii="Times New Roman" w:hAnsi="Times New Roman" w:cs="Times New Roman" w:eastAsia="Times New Roman"/>
           <w:b w:val="0"/>
           <w:i w:val="0"/>
-          <w:sz w:val="22"/>
+          <w:sz w:val="20"/>
         </w:rPr>
         <w:t>Запознат/а съм, че съгласно Наредба № 7 за определянето и администрирането на местните такси и цени на услуги на територията на община Троян, цената на услуга с ДДС е:</w:t>
       </w:r>
@@ -1821,7 +1821,7 @@
           <w:rFonts w:ascii="Times New Roman" w:hAnsi="Times New Roman" w:cs="Times New Roman" w:eastAsia="Times New Roman"/>
           <w:b/>
           <w:i w:val="0"/>
-          <w:sz w:val="28"/>
+          <w:sz w:val="24"/>
         </w:rPr>
         <w:t>За спортна зала:</w:t>
       </w:r>
@@ -1851,7 +1851,7 @@
                 <w:rFonts w:ascii="Times New Roman" w:hAnsi="Times New Roman" w:cs="Times New Roman" w:eastAsia="Times New Roman"/>
                 <w:b/>
                 <w:i w:val="0"/>
-                <w:sz w:val="20"/>
+                <w:sz w:val="18"/>
               </w:rPr>
               <w:t>Наименование на услугата</w:t>
             </w:r>
@@ -1871,7 +1871,7 @@
                 <w:rFonts w:ascii="Times New Roman" w:hAnsi="Times New Roman" w:cs="Times New Roman" w:eastAsia="Times New Roman"/>
                 <w:b/>
                 <w:i w:val="0"/>
-                <w:sz w:val="20"/>
+                <w:sz w:val="18"/>
               </w:rPr>
               <w:t>цена в евро</w:t>
             </w:r>
@@ -1893,7 +1893,7 @@
                 <w:rFonts w:ascii="Times New Roman" w:hAnsi="Times New Roman" w:cs="Times New Roman" w:eastAsia="Times New Roman"/>
                 <w:b w:val="0"/>
                 <w:i w:val="0"/>
-                <w:sz w:val="20"/>
+                <w:sz w:val="18"/>
               </w:rPr>
               <w:t>1.1. Почасово ползване за тренировъчна дейност и провеждане на състезания и турнири от спортни клубове, регистрирани и осъществяващи дейност на територията на община Троян</w:t>
             </w:r>
@@ -1913,7 +1913,7 @@
                 <w:rFonts w:ascii="Times New Roman" w:hAnsi="Times New Roman" w:cs="Times New Roman" w:eastAsia="Times New Roman"/>
                 <w:b w:val="0"/>
                 <w:i w:val="0"/>
-                <w:sz w:val="20"/>
+                <w:sz w:val="18"/>
               </w:rPr>
               <w:t>8,00 евро/час</w:t>
             </w:r>
@@ -1935,7 +1935,7 @@
                 <w:rFonts w:ascii="Times New Roman" w:hAnsi="Times New Roman" w:cs="Times New Roman" w:eastAsia="Times New Roman"/>
                 <w:b w:val="0"/>
                 <w:i w:val="0"/>
-                <w:sz w:val="20"/>
+                <w:sz w:val="18"/>
               </w:rPr>
               <w:t>1.2. Почасово ползване за тренировъчна дейност на външни спортни клубове и организации</w:t>
             </w:r>
@@ -1955,7 +1955,7 @@
                 <w:rFonts w:ascii="Times New Roman" w:hAnsi="Times New Roman" w:cs="Times New Roman" w:eastAsia="Times New Roman"/>
                 <w:b w:val="0"/>
                 <w:i w:val="0"/>
-                <w:sz w:val="20"/>
+                <w:sz w:val="18"/>
               </w:rPr>
               <w:t>25,00 евро/час</w:t>
             </w:r>
@@ -1977,7 +1977,7 @@
                 <w:rFonts w:ascii="Times New Roman" w:hAnsi="Times New Roman" w:cs="Times New Roman" w:eastAsia="Times New Roman"/>
                 <w:b w:val="0"/>
                 <w:i w:val="0"/>
-                <w:sz w:val="20"/>
+                <w:sz w:val="18"/>
               </w:rPr>
               <w:t>1.3. Дневно ползване (до 8 часа в диапазона 08:00 ч. – 22:00 ч.)</w:t>
             </w:r>
@@ -1997,7 +1997,7 @@
                 <w:rFonts w:ascii="Times New Roman" w:hAnsi="Times New Roman" w:cs="Times New Roman" w:eastAsia="Times New Roman"/>
                 <w:b w:val="0"/>
                 <w:i w:val="0"/>
-                <w:sz w:val="20"/>
+                <w:sz w:val="18"/>
               </w:rPr>
             </w:r>
           </w:p>
@@ -2018,7 +2018,7 @@
                 <w:rFonts w:ascii="Times New Roman" w:hAnsi="Times New Roman" w:cs="Times New Roman" w:eastAsia="Times New Roman"/>
                 <w:b w:val="0"/>
                 <w:i w:val="0"/>
-                <w:sz w:val="20"/>
+                <w:sz w:val="18"/>
               </w:rPr>
               <w:t>1.3.1. за турнири и спортни прояви с публика, организирани от външни клубове – 240,00 евро</w:t>
             </w:r>
@@ -2038,7 +2038,7 @@
                 <w:rFonts w:ascii="Times New Roman" w:hAnsi="Times New Roman" w:cs="Times New Roman" w:eastAsia="Times New Roman"/>
                 <w:b w:val="0"/>
                 <w:i w:val="0"/>
-                <w:sz w:val="20"/>
+                <w:sz w:val="18"/>
               </w:rPr>
               <w:t>240 евро</w:t>
             </w:r>
@@ -2060,7 +2060,7 @@
                 <w:rFonts w:ascii="Times New Roman" w:hAnsi="Times New Roman" w:cs="Times New Roman" w:eastAsia="Times New Roman"/>
                 <w:b w:val="0"/>
                 <w:i w:val="0"/>
-                <w:sz w:val="20"/>
+                <w:sz w:val="18"/>
               </w:rPr>
               <w:t>1.3.2.  за събития с ниско натоварване</w:t>
             </w:r>
@@ -2080,7 +2080,7 @@
                 <w:rFonts w:ascii="Times New Roman" w:hAnsi="Times New Roman" w:cs="Times New Roman" w:eastAsia="Times New Roman"/>
                 <w:b w:val="0"/>
                 <w:i w:val="0"/>
-                <w:sz w:val="20"/>
+                <w:sz w:val="18"/>
               </w:rPr>
               <w:t>240 евро</w:t>
             </w:r>
@@ -2102,7 +2102,7 @@
                 <w:rFonts w:ascii="Times New Roman" w:hAnsi="Times New Roman" w:cs="Times New Roman" w:eastAsia="Times New Roman"/>
                 <w:b w:val="0"/>
                 <w:i w:val="0"/>
-                <w:sz w:val="20"/>
+                <w:sz w:val="18"/>
               </w:rPr>
               <w:t>1.3.3.  за събития със средно натоварване</w:t>
             </w:r>
@@ -2122,7 +2122,7 @@
                 <w:rFonts w:ascii="Times New Roman" w:hAnsi="Times New Roman" w:cs="Times New Roman" w:eastAsia="Times New Roman"/>
                 <w:b w:val="0"/>
                 <w:i w:val="0"/>
-                <w:sz w:val="20"/>
+                <w:sz w:val="18"/>
               </w:rPr>
               <w:t>360 евро</w:t>
             </w:r>
@@ -2144,7 +2144,7 @@
                 <w:rFonts w:ascii="Times New Roman" w:hAnsi="Times New Roman" w:cs="Times New Roman" w:eastAsia="Times New Roman"/>
                 <w:b w:val="0"/>
                 <w:i w:val="0"/>
-                <w:sz w:val="20"/>
+                <w:sz w:val="18"/>
               </w:rPr>
               <w:t>1.3.4.  за събития с високо натоварване</w:t>
             </w:r>
@@ -2164,7 +2164,7 @@
                 <w:rFonts w:ascii="Times New Roman" w:hAnsi="Times New Roman" w:cs="Times New Roman" w:eastAsia="Times New Roman"/>
                 <w:b w:val="0"/>
                 <w:i w:val="0"/>
-                <w:sz w:val="20"/>
+                <w:sz w:val="18"/>
               </w:rPr>
               <w:t>480 евро</w:t>
             </w:r>
@@ -2186,7 +2186,7 @@
           <w:rFonts w:ascii="Times New Roman" w:hAnsi="Times New Roman" w:cs="Times New Roman" w:eastAsia="Times New Roman"/>
           <w:b/>
           <w:i w:val="0"/>
-          <w:sz w:val="28"/>
+          <w:sz w:val="24"/>
         </w:rPr>
         <w:t>За тренировъчна зала:</w:t>
       </w:r>
@@ -2216,7 +2216,7 @@
                 <w:rFonts w:ascii="Times New Roman" w:hAnsi="Times New Roman" w:cs="Times New Roman" w:eastAsia="Times New Roman"/>
                 <w:b/>
                 <w:i w:val="0"/>
-                <w:sz w:val="20"/>
+                <w:sz w:val="18"/>
               </w:rPr>
               <w:t>Наименование на услугата</w:t>
             </w:r>
@@ -2236,7 +2236,7 @@
                 <w:rFonts w:ascii="Times New Roman" w:hAnsi="Times New Roman" w:cs="Times New Roman" w:eastAsia="Times New Roman"/>
                 <w:b/>
                 <w:i w:val="0"/>
-                <w:sz w:val="20"/>
+                <w:sz w:val="18"/>
               </w:rPr>
               <w:t>цена в евро</w:t>
             </w:r>
@@ -2258,7 +2258,7 @@
                 <w:rFonts w:ascii="Times New Roman" w:hAnsi="Times New Roman" w:cs="Times New Roman" w:eastAsia="Times New Roman"/>
                 <w:b w:val="0"/>
                 <w:i w:val="0"/>
-                <w:sz w:val="20"/>
+                <w:sz w:val="18"/>
               </w:rPr>
               <w:t>2.1. Почасово ползване за тренировъчна дейност и провеждане на състезания и турнири от спортни клубове, регистрирани и осъществяващи дейност на територията на община Троян</w:t>
             </w:r>
@@ -2278,7 +2278,7 @@
                 <w:rFonts w:ascii="Times New Roman" w:hAnsi="Times New Roman" w:cs="Times New Roman" w:eastAsia="Times New Roman"/>
                 <w:b w:val="0"/>
                 <w:i w:val="0"/>
-                <w:sz w:val="20"/>
+                <w:sz w:val="18"/>
               </w:rPr>
               <w:t>5,00 евро/час</w:t>
             </w:r>
@@ -2300,7 +2300,7 @@
                 <w:rFonts w:ascii="Times New Roman" w:hAnsi="Times New Roman" w:cs="Times New Roman" w:eastAsia="Times New Roman"/>
                 <w:b w:val="0"/>
                 <w:i w:val="0"/>
-                <w:sz w:val="20"/>
+                <w:sz w:val="18"/>
               </w:rPr>
               <w:t>2.2. Почасово ползване за тренировъчна дейност и провеждане на състезания и турнири на външни спортни клубове и организации</w:t>
             </w:r>
@@ -2320,7 +2320,7 @@
                 <w:rFonts w:ascii="Times New Roman" w:hAnsi="Times New Roman" w:cs="Times New Roman" w:eastAsia="Times New Roman"/>
                 <w:b w:val="0"/>
                 <w:i w:val="0"/>
-                <w:sz w:val="20"/>
+                <w:sz w:val="18"/>
               </w:rPr>
               <w:t>15,00 евро/час</w:t>
             </w:r>
@@ -2342,7 +2342,7 @@
           <w:rFonts w:ascii="Times New Roman" w:hAnsi="Times New Roman" w:cs="Times New Roman" w:eastAsia="Times New Roman"/>
           <w:b/>
           <w:i w:val="0"/>
-          <w:sz w:val="28"/>
+          <w:sz w:val="24"/>
         </w:rPr>
         <w:t>За конферентна зала:</w:t>
       </w:r>
@@ -2372,7 +2372,7 @@
                 <w:rFonts w:ascii="Times New Roman" w:hAnsi="Times New Roman" w:cs="Times New Roman" w:eastAsia="Times New Roman"/>
                 <w:b/>
                 <w:i w:val="0"/>
-                <w:sz w:val="20"/>
+                <w:sz w:val="18"/>
               </w:rPr>
               <w:t>Наименование на услугата</w:t>
             </w:r>
@@ -2392,7 +2392,7 @@
                 <w:rFonts w:ascii="Times New Roman" w:hAnsi="Times New Roman" w:cs="Times New Roman" w:eastAsia="Times New Roman"/>
                 <w:b/>
                 <w:i w:val="0"/>
-                <w:sz w:val="20"/>
+                <w:sz w:val="18"/>
               </w:rPr>
               <w:t>цена в евро</w:t>
             </w:r>
@@ -2414,7 +2414,7 @@
                 <w:rFonts w:ascii="Times New Roman" w:hAnsi="Times New Roman" w:cs="Times New Roman" w:eastAsia="Times New Roman"/>
                 <w:b w:val="0"/>
                 <w:i w:val="0"/>
-                <w:sz w:val="20"/>
+                <w:sz w:val="18"/>
               </w:rPr>
               <w:t>3.1. Почасово ползване на конферентна зала в Многофункционална спортна зала „Троян“</w:t>
             </w:r>
@@ -2434,7 +2434,7 @@
                 <w:rFonts w:ascii="Times New Roman" w:hAnsi="Times New Roman" w:cs="Times New Roman" w:eastAsia="Times New Roman"/>
                 <w:b w:val="0"/>
                 <w:i w:val="0"/>
-                <w:sz w:val="20"/>
+                <w:sz w:val="18"/>
               </w:rPr>
               <w:t>15,00 евро/час</w:t>
             </w:r>
@@ -2456,7 +2456,7 @@
           <w:rFonts w:ascii="Times New Roman" w:hAnsi="Times New Roman" w:cs="Times New Roman" w:eastAsia="Times New Roman"/>
           <w:b w:val="0"/>
           <w:i w:val="0"/>
-          <w:sz w:val="22"/>
+          <w:sz w:val="20"/>
         </w:rPr>
         <w:t>Дължимата сума се заплаща до 3 работни дни след получаване на Разрешение за ползване на:</w:t>
       </w:r>
@@ -2470,7 +2470,7 @@
           <w:rFonts w:ascii="Times New Roman" w:hAnsi="Times New Roman" w:cs="Times New Roman" w:eastAsia="Times New Roman"/>
           <w:b w:val="0"/>
           <w:i w:val="0"/>
-          <w:sz w:val="22"/>
+          <w:sz w:val="20"/>
         </w:rPr>
         <w:t>1. Касата на Община Троян – административна сграда на адрес Троян, пл. „Възраждане“ № 1</w:t>
       </w:r>
@@ -2484,7 +2484,7 @@
           <w:rFonts w:ascii="Times New Roman" w:hAnsi="Times New Roman" w:cs="Times New Roman" w:eastAsia="Times New Roman"/>
           <w:b w:val="0"/>
           <w:i w:val="0"/>
-          <w:sz w:val="22"/>
+          <w:sz w:val="20"/>
         </w:rPr>
         <w:t>2. С ПОС терминал в отдел „Услуги на гражданите“</w:t>
       </w:r>
@@ -2498,7 +2498,7 @@
           <w:rFonts w:ascii="Times New Roman" w:hAnsi="Times New Roman" w:cs="Times New Roman" w:eastAsia="Times New Roman"/>
           <w:b w:val="0"/>
           <w:i w:val="0"/>
-          <w:sz w:val="22"/>
+          <w:sz w:val="20"/>
         </w:rPr>
         <w:t>3. По банков път на сметка:</w:t>
       </w:r>
@@ -2512,7 +2512,7 @@
           <w:rFonts w:ascii="Times New Roman" w:hAnsi="Times New Roman" w:cs="Times New Roman" w:eastAsia="Times New Roman"/>
           <w:b w:val="0"/>
           <w:i w:val="0"/>
-          <w:sz w:val="22"/>
+          <w:sz w:val="20"/>
         </w:rPr>
         <w:t>IBAN: BG92UBBS81558420008108</w:t>
       </w:r>
@@ -2526,7 +2526,7 @@
           <w:rFonts w:ascii="Times New Roman" w:hAnsi="Times New Roman" w:cs="Times New Roman" w:eastAsia="Times New Roman"/>
           <w:b w:val="0"/>
           <w:i w:val="0"/>
-          <w:sz w:val="22"/>
+          <w:sz w:val="20"/>
         </w:rPr>
         <w:t>BIC: UBBSBGSF</w:t>
       </w:r>
@@ -2540,7 +2540,7 @@
           <w:rFonts w:ascii="Times New Roman" w:hAnsi="Times New Roman" w:cs="Times New Roman" w:eastAsia="Times New Roman"/>
           <w:b w:val="0"/>
           <w:i w:val="0"/>
-          <w:sz w:val="22"/>
+          <w:sz w:val="20"/>
         </w:rPr>
         <w:t>Банка: „Обединена Българска Банка“ АД</w:t>
       </w:r>
@@ -2554,7 +2554,7 @@
           <w:rFonts w:ascii="Times New Roman" w:hAnsi="Times New Roman" w:cs="Times New Roman" w:eastAsia="Times New Roman"/>
           <w:b w:val="0"/>
           <w:i/>
-          <w:sz w:val="20"/>
+          <w:sz w:val="18"/>
         </w:rPr>
         <w:t>* Забележка: При невнасяне на дължимите такси в регламентирания срок, заявлението се счита оттеглено.</w:t>
       </w:r>
@@ -2571,7 +2571,7 @@
           <w:rFonts w:ascii="Times New Roman" w:hAnsi="Times New Roman" w:cs="Times New Roman" w:eastAsia="Times New Roman"/>
           <w:b w:val="0"/>
           <w:i w:val="0"/>
-          <w:sz w:val="28"/>
+          <w:sz w:val="24"/>
         </w:rPr>
         <w:t xml:space="preserve">Дата: </w:t>
       </w:r>
@@ -2580,7 +2580,7 @@
           <w:rFonts w:ascii="Times New Roman" w:hAnsi="Times New Roman" w:cs="Times New Roman" w:eastAsia="Times New Roman"/>
           <w:b w:val="0"/>
           <w:i w:val="0"/>
-          <w:sz w:val="28"/>
+          <w:sz w:val="24"/>
         </w:rPr>
         <w:t>{{TODAY}}</w:t>
       </w:r>
@@ -2589,7 +2589,7 @@
           <w:rFonts w:ascii="Times New Roman" w:hAnsi="Times New Roman" w:cs="Times New Roman" w:eastAsia="Times New Roman"/>
           <w:b w:val="0"/>
           <w:i w:val="0"/>
-          <w:sz w:val="28"/>
+          <w:sz w:val="24"/>
         </w:rPr>
         <w:t xml:space="preserve"> г.</w:t>
       </w:r>
@@ -2598,7 +2598,7 @@
           <w:rFonts w:ascii="Times New Roman" w:hAnsi="Times New Roman" w:cs="Times New Roman" w:eastAsia="Times New Roman"/>
           <w:b w:val="0"/>
           <w:i w:val="0"/>
-          <w:sz w:val="28"/>
+          <w:sz w:val="24"/>
         </w:rPr>
         <w:tab/>
       </w:r>
@@ -2607,7 +2607,7 @@
           <w:rFonts w:ascii="Times New Roman" w:hAnsi="Times New Roman" w:cs="Times New Roman" w:eastAsia="Times New Roman"/>
           <w:b w:val="0"/>
           <w:i w:val="0"/>
-          <w:sz w:val="28"/>
+          <w:sz w:val="24"/>
         </w:rPr>
         <w:t>С уважение: ..............................................</w:t>
       </w:r>
@@ -2624,7 +2624,7 @@
           <w:rFonts w:ascii="Times New Roman" w:hAnsi="Times New Roman" w:cs="Times New Roman" w:eastAsia="Times New Roman"/>
           <w:b w:val="0"/>
           <w:i w:val="0"/>
-          <w:sz w:val="28"/>
+          <w:sz w:val="24"/>
         </w:rPr>
         <w:t>Град Троян</w:t>
       </w:r>
@@ -2633,7 +2633,7 @@
           <w:rFonts w:ascii="Times New Roman" w:hAnsi="Times New Roman" w:cs="Times New Roman" w:eastAsia="Times New Roman"/>
           <w:b w:val="0"/>
           <w:i w:val="0"/>
-          <w:sz w:val="28"/>
+          <w:sz w:val="24"/>
         </w:rPr>
         <w:tab/>
       </w:r>
@@ -2642,7 +2642,7 @@
           <w:rFonts w:ascii="Times New Roman" w:hAnsi="Times New Roman" w:cs="Times New Roman" w:eastAsia="Times New Roman"/>
           <w:b w:val="0"/>
           <w:i w:val="0"/>
-          <w:sz w:val="20"/>
+          <w:sz w:val="18"/>
         </w:rPr>
         <w:t>(подпис)</w:t>
       </w:r>
@@ -3022,7 +3022,7 @@
     <w:rsid w:val="00FC693F"/>
     <w:rPr>
       <w:rFonts w:ascii="Times New Roman" w:hAnsi="Times New Roman" w:cs="Times New Roman" w:eastAsia="Times New Roman"/>
-      <w:sz w:val="28"/>
+      <w:sz w:val="24"/>
     </w:rPr>
   </w:style>
   <w:style w:type="paragraph" w:styleId="Header">

</xml_diff>